<commit_message>
Refine Invoice Gen (Dynamic Rows, Zero Prices, Drive Path) and Fix Delivery List Mapping
</commit_message>
<xml_diff>
--- a/data/outputs/배송리스트_20260129.docx
+++ b/data/outputs/배송리스트_20260129.docx
@@ -35,7 +35,7 @@
                 <w:color w:val="000000"/>
                 <w:sz w:val="30"/>
               </w:rPr>
-              <w:t>-고른햇살</w:t>
+              <w:t>-샤브야키 도봉점</w:t>
             </w:r>
           </w:p>
           <w:p>
@@ -49,7 +49,7 @@
                 <w:color w:val="000000"/>
                 <w:sz w:val="30"/>
               </w:rPr>
-              <w:t>쑥갓 1박스</w:t>
+              <w:t>숙주 6박스</w:t>
             </w:r>
           </w:p>
           <w:p>
@@ -63,7 +63,7 @@
                 <w:color w:val="000000"/>
                 <w:sz w:val="30"/>
               </w:rPr>
-              <w:t>일자콩나물 1박스</w:t>
+              <w:t>청경채 4박스</w:t>
             </w:r>
           </w:p>
           <w:p>
@@ -77,7 +77,7 @@
                 <w:color w:val="000000"/>
                 <w:sz w:val="30"/>
               </w:rPr>
-              <w:t>흙대파 10단</w:t>
+              <w:t>깐대파 10kg</w:t>
             </w:r>
           </w:p>
           <w:p>
@@ -91,7 +91,7 @@
                 <w:color w:val="000000"/>
                 <w:sz w:val="30"/>
               </w:rPr>
-              <w:t>피양파 2망</w:t>
+              <w:t>배추 3망( 9포기)</w:t>
             </w:r>
           </w:p>
           <w:p>
@@ -105,7 +105,7 @@
                 <w:color w:val="000000"/>
                 <w:sz w:val="30"/>
               </w:rPr>
-              <w:t>취청오이(특,굵은) 3박스</w:t>
+              <w:t>청양고추 1박스</w:t>
             </w:r>
           </w:p>
           <w:p>
@@ -119,7 +119,7 @@
                 <w:color w:val="000000"/>
                 <w:sz w:val="30"/>
               </w:rPr>
-              <w:t>세척당근(3L) 1박스</w:t>
+              <w:t>케일 1박스</w:t>
             </w:r>
           </w:p>
           <w:p>
@@ -133,7 +133,7 @@
                 <w:color w:val="000000"/>
                 <w:sz w:val="30"/>
               </w:rPr>
-              <w:t>깐양배추45 3망</w:t>
+              <w:t>쑥갓 2박스</w:t>
             </w:r>
           </w:p>
           <w:p>
@@ -147,7 +147,203 @@
                 <w:color w:val="000000"/>
                 <w:sz w:val="30"/>
               </w:rPr>
-              <w:t>청상추 1박스</w:t>
+              <w:t>근대 2박스</w:t>
+            </w:r>
+          </w:p>
+          <w:p>
+            <w:pPr>
+              <w:spacing w:before="20" w:after="20" w:line="360" w:lineRule="exact"/>
+              <w:ind w:left="0" w:firstLine="0"/>
+            </w:pPr>
+            <w:r>
+              <w:rPr>
+                <w:rFonts w:ascii="맑은 고딕" w:hAnsi="맑은 고딕" w:eastAsia="맑은 고딕"/>
+                <w:color w:val="000000"/>
+                <w:sz w:val="30"/>
+              </w:rPr>
+              <w:t>돌미나리 2박스</w:t>
+            </w:r>
+          </w:p>
+          <w:p>
+            <w:pPr>
+              <w:spacing w:before="20" w:after="20" w:line="360" w:lineRule="exact"/>
+              <w:ind w:left="0" w:firstLine="0"/>
+            </w:pPr>
+            <w:r>
+              <w:rPr>
+                <w:rFonts w:ascii="맑은 고딕" w:hAnsi="맑은 고딕" w:eastAsia="맑은 고딕"/>
+                <w:color w:val="000000"/>
+                <w:sz w:val="30"/>
+              </w:rPr>
+              <w:t>새송이 2박스</w:t>
+            </w:r>
+          </w:p>
+          <w:p>
+            <w:pPr>
+              <w:spacing w:before="20" w:after="20" w:line="360" w:lineRule="exact"/>
+              <w:ind w:left="0" w:firstLine="0"/>
+            </w:pPr>
+            <w:r>
+              <w:rPr>
+                <w:rFonts w:ascii="맑은 고딕" w:hAnsi="맑은 고딕" w:eastAsia="맑은 고딕"/>
+                <w:color w:val="000000"/>
+                <w:sz w:val="30"/>
+              </w:rPr>
+              <w:t>양배추45 1망( 3통)</w:t>
+            </w:r>
+          </w:p>
+          <w:p>
+            <w:pPr>
+              <w:spacing w:before="20" w:after="20" w:line="360" w:lineRule="exact"/>
+              <w:ind w:left="0" w:firstLine="0"/>
+            </w:pPr>
+            <w:r>
+              <w:rPr>
+                <w:rFonts w:ascii="맑은 고딕" w:hAnsi="맑은 고딕" w:eastAsia="맑은 고딕"/>
+                <w:color w:val="000000"/>
+                <w:sz w:val="30"/>
+              </w:rPr>
+              <w:t>새싹(대) 4팩</w:t>
+            </w:r>
+          </w:p>
+          <w:p>
+            <w:pPr>
+              <w:spacing w:before="20" w:after="20" w:line="360" w:lineRule="exact"/>
+              <w:ind w:left="0" w:firstLine="0"/>
+            </w:pPr>
+            <w:r>
+              <w:rPr>
+                <w:rFonts w:ascii="맑은 고딕" w:hAnsi="맑은 고딕" w:eastAsia="맑은 고딕"/>
+                <w:color w:val="000000"/>
+                <w:sz w:val="30"/>
+              </w:rPr>
+              <w:t>깐양파 5kg</w:t>
+            </w:r>
+          </w:p>
+          <w:p>
+            <w:pPr>
+              <w:spacing w:before="20" w:after="20" w:line="360" w:lineRule="exact"/>
+              <w:ind w:left="0" w:firstLine="0"/>
+            </w:pPr>
+            <w:r>
+              <w:rPr>
+                <w:rFonts w:ascii="맑은 고딕" w:hAnsi="맑은 고딕" w:eastAsia="맑은 고딕"/>
+                <w:color w:val="000000"/>
+                <w:sz w:val="30"/>
+              </w:rPr>
+              <w:t>취청오이(특) 1박스</w:t>
+            </w:r>
+          </w:p>
+          <w:p>
+            <w:pPr>
+              <w:spacing w:before="20" w:after="20" w:line="360" w:lineRule="exact"/>
+              <w:ind w:left="0" w:firstLine="0"/>
+            </w:pPr>
+            <w:r>
+              <w:rPr>
+                <w:rFonts w:ascii="맑은 고딕" w:hAnsi="맑은 고딕" w:eastAsia="맑은 고딕"/>
+                <w:color w:val="000000"/>
+                <w:sz w:val="30"/>
+              </w:rPr>
+              <w:t>세척당근 1박스</w:t>
+            </w:r>
+          </w:p>
+          <w:p>
+            <w:pPr>
+              <w:spacing w:before="20" w:after="20" w:line="360" w:lineRule="exact"/>
+              <w:ind w:left="0" w:firstLine="0"/>
+            </w:pPr>
+            <w:r>
+              <w:rPr>
+                <w:rFonts w:ascii="맑은 고딕" w:hAnsi="맑은 고딕" w:eastAsia="맑은 고딕"/>
+                <w:color w:val="000000"/>
+                <w:sz w:val="30"/>
+              </w:rPr>
+              <w:t>깻잎(1k) 2박스</w:t>
+            </w:r>
+          </w:p>
+          <w:p>
+            <w:pPr>
+              <w:spacing w:before="20" w:after="20" w:line="360" w:lineRule="exact"/>
+              <w:ind w:left="0" w:firstLine="0"/>
+            </w:pPr>
+            <w:r>
+              <w:rPr>
+                <w:rFonts w:ascii="맑은 고딕" w:hAnsi="맑은 고딕" w:eastAsia="맑은 고딕"/>
+                <w:color w:val="000000"/>
+                <w:sz w:val="30"/>
+              </w:rPr>
+              <w:t>맛느타리 2박스</w:t>
+            </w:r>
+          </w:p>
+          <w:p>
+            <w:pPr>
+              <w:spacing w:before="20" w:after="20" w:line="360" w:lineRule="exact"/>
+              <w:ind w:left="0" w:firstLine="0"/>
+            </w:pPr>
+            <w:r>
+              <w:rPr>
+                <w:rFonts w:ascii="맑은 고딕" w:hAnsi="맑은 고딕" w:eastAsia="맑은 고딕"/>
+                <w:color w:val="000000"/>
+                <w:sz w:val="30"/>
+              </w:rPr>
+              <w:t>백목이버섯 2박스( 12k)</w:t>
+            </w:r>
+          </w:p>
+          <w:p>
+            <w:pPr>
+              <w:spacing w:before="20" w:after="20" w:line="360" w:lineRule="exact"/>
+              <w:ind w:left="0" w:firstLine="0"/>
+            </w:pPr>
+            <w:r>
+              <w:rPr>
+                <w:rFonts w:ascii="맑은 고딕" w:hAnsi="맑은 고딕" w:eastAsia="맑은 고딕"/>
+                <w:color w:val="000000"/>
+                <w:sz w:val="30"/>
+              </w:rPr>
+              <w:t>목이버섯 2박스( 20k)</w:t>
+            </w:r>
+          </w:p>
+          <w:p>
+            <w:pPr>
+              <w:spacing w:before="20" w:after="20" w:line="360" w:lineRule="exact"/>
+              <w:ind w:left="0" w:firstLine="0"/>
+            </w:pPr>
+            <w:r>
+              <w:rPr>
+                <w:rFonts w:ascii="맑은 고딕" w:hAnsi="맑은 고딕" w:eastAsia="맑은 고딕"/>
+                <w:color w:val="000000"/>
+                <w:sz w:val="30"/>
+              </w:rPr>
+              <w:t>팽이 2박스</w:t>
+            </w:r>
+          </w:p>
+          <w:p>
+            <w:pPr>
+              <w:spacing w:before="20" w:after="20" w:line="360" w:lineRule="exact"/>
+              <w:ind w:left="0" w:firstLine="0"/>
+            </w:pPr>
+            <w:r>
+              <w:rPr>
+                <w:rFonts w:ascii="맑은 고딕" w:hAnsi="맑은 고딕" w:eastAsia="맑은 고딕"/>
+                <w:color w:val="000000"/>
+                <w:sz w:val="30"/>
+              </w:rPr>
+              <w:t>중란 3판</w:t>
+            </w:r>
+          </w:p>
+          <w:p>
+            <w:pPr>
+              <w:spacing w:before="20" w:after="20" w:line="360" w:lineRule="exact"/>
+              <w:ind w:left="0" w:firstLine="0"/>
+            </w:pPr>
+            <w:r>
+              <w:rPr>
+                <w:rFonts w:ascii="맑은 고딕" w:hAnsi="맑은 고딕" w:eastAsia="맑은 고딕"/>
+                <w:color w:val="000000"/>
+                <w:sz w:val="30"/>
+              </w:rPr>
+              <w:t>귤 2박스</w:t>
             </w:r>
           </w:p>
           <w:p>
@@ -162,7 +358,7 @@
                 <w:color w:val="000000"/>
                 <w:sz w:val="30"/>
               </w:rPr>
-              <w:t>-선데이버거클럽</w:t>
+              <w:t>-소유 프루트(어제선발주완료)</w:t>
             </w:r>
           </w:p>
           <w:p>
@@ -176,7 +372,7 @@
                 <w:color w:val="000000"/>
                 <w:sz w:val="30"/>
               </w:rPr>
-              <w:t>깐양배추42 1통</w:t>
+              <w:t>애플망고 1박스</w:t>
             </w:r>
           </w:p>
           <w:p>
@@ -187,10 +383,10 @@
             <w:r>
               <w:rPr>
                 <w:rFonts w:ascii="맑은 고딕" w:hAnsi="맑은 고딕" w:eastAsia="맑은 고딕"/>
-                <w:color w:val="FF0000"/>
-                <w:sz w:val="30"/>
-              </w:rPr>
-              <w:t>적채 1통</w:t>
+                <w:color w:val="000000"/>
+                <w:sz w:val="30"/>
+              </w:rPr>
+              <w:t>용과 1박스</w:t>
             </w:r>
           </w:p>
           <w:p>
@@ -204,7 +400,7 @@
                 <w:color w:val="000000"/>
                 <w:sz w:val="30"/>
               </w:rPr>
-              <w:t>완숙토마토1호 1박스</w:t>
+              <w:t>미니허니파인10수 1박스</w:t>
             </w:r>
           </w:p>
           <w:p>
@@ -218,7 +414,21 @@
                 <w:color w:val="000000"/>
                 <w:sz w:val="30"/>
               </w:rPr>
-              <w:t>깐양파 10kg</w:t>
+              <w:t>금실딸기 1박스</w:t>
+            </w:r>
+          </w:p>
+          <w:p>
+            <w:pPr>
+              <w:spacing w:before="20" w:after="20" w:line="360" w:lineRule="exact"/>
+              <w:ind w:left="0" w:firstLine="0"/>
+            </w:pPr>
+            <w:r>
+              <w:rPr>
+                <w:rFonts w:ascii="맑은 고딕" w:hAnsi="맑은 고딕" w:eastAsia="맑은 고딕"/>
+                <w:color w:val="000000"/>
+                <w:sz w:val="30"/>
+              </w:rPr>
+              <w:t>샤인머스켓4수 1박스</w:t>
             </w:r>
           </w:p>
           <w:p>
@@ -233,7 +443,7 @@
                 <w:color w:val="000000"/>
                 <w:sz w:val="30"/>
               </w:rPr>
-              <w:t>-오레노이키루미치 압구정점</w:t>
+              <w:t>-육회꽃필무렵</w:t>
             </w:r>
           </w:p>
           <w:p>
@@ -247,7 +457,120 @@
                 <w:color w:val="000000"/>
                 <w:sz w:val="30"/>
               </w:rPr>
-              <w:t>굵은숙주 15박스</w:t>
+              <w:t>곱슬이콩나물 2박스</w:t>
+            </w:r>
+          </w:p>
+          <w:p>
+            <w:pPr>
+              <w:spacing w:before="20" w:after="20" w:line="360" w:lineRule="exact"/>
+              <w:ind w:left="0" w:firstLine="0"/>
+            </w:pPr>
+            <w:r>
+              <w:rPr>
+                <w:rFonts w:ascii="맑은 고딕" w:hAnsi="맑은 고딕" w:eastAsia="맑은 고딕"/>
+                <w:color w:val="000000"/>
+                <w:sz w:val="30"/>
+              </w:rPr>
+              <w:t>적채 5통</w:t>
+            </w:r>
+          </w:p>
+          <w:p>
+            <w:pPr>
+              <w:spacing w:before="20" w:after="20" w:line="360" w:lineRule="exact"/>
+              <w:ind w:left="0" w:firstLine="0"/>
+            </w:pPr>
+            <w:r>
+              <w:rPr>
+                <w:rFonts w:ascii="맑은 고딕" w:hAnsi="맑은 고딕" w:eastAsia="맑은 고딕"/>
+                <w:color w:val="000000"/>
+                <w:sz w:val="30"/>
+              </w:rPr>
+              <w:t>대란 5판</w:t>
+            </w:r>
+          </w:p>
+          <w:p>
+            <w:pPr>
+              <w:spacing w:before="300" w:after="20" w:line="360" w:lineRule="exact"/>
+              <w:ind w:left="0" w:firstLine="0"/>
+            </w:pPr>
+            <w:r>
+              <w:rPr>
+                <w:rFonts w:ascii="맑은 고딕" w:hAnsi="맑은 고딕" w:eastAsia="맑은 고딕"/>
+                <w:b/>
+                <w:color w:val="000000"/>
+                <w:sz w:val="30"/>
+              </w:rPr>
+              <w:t>-이너프유</w:t>
+            </w:r>
+          </w:p>
+          <w:p>
+            <w:pPr>
+              <w:spacing w:before="20" w:after="20" w:line="360" w:lineRule="exact"/>
+              <w:ind w:left="0" w:firstLine="0"/>
+            </w:pPr>
+            <w:r>
+              <w:rPr>
+                <w:rFonts w:ascii="맑은 고딕" w:hAnsi="맑은 고딕" w:eastAsia="맑은 고딕"/>
+                <w:color w:val="000000"/>
+                <w:sz w:val="30"/>
+              </w:rPr>
+              <w:t>깐양파 30kg</w:t>
+            </w:r>
+          </w:p>
+          <w:p>
+            <w:pPr>
+              <w:spacing w:before="20" w:after="20" w:line="360" w:lineRule="exact"/>
+              <w:ind w:left="0" w:firstLine="0"/>
+            </w:pPr>
+            <w:r>
+              <w:rPr>
+                <w:rFonts w:ascii="맑은 고딕" w:hAnsi="맑은 고딕" w:eastAsia="맑은 고딕"/>
+                <w:color w:val="000000"/>
+                <w:sz w:val="30"/>
+              </w:rPr>
+              <w:t>새송이(국산,상,2k) 20박스( 40k)</w:t>
+            </w:r>
+          </w:p>
+          <w:p>
+            <w:pPr>
+              <w:spacing w:before="20" w:after="20" w:line="360" w:lineRule="exact"/>
+              <w:ind w:left="0" w:firstLine="0"/>
+            </w:pPr>
+            <w:r>
+              <w:rPr>
+                <w:rFonts w:ascii="맑은 고딕" w:hAnsi="맑은 고딕" w:eastAsia="맑은 고딕"/>
+                <w:color w:val="000000"/>
+                <w:sz w:val="30"/>
+              </w:rPr>
+              <w:t>애호박(국산,상,6.5k) 4박스</w:t>
+            </w:r>
+          </w:p>
+          <w:p>
+            <w:pPr>
+              <w:spacing w:before="20" w:after="20" w:line="360" w:lineRule="exact"/>
+              <w:ind w:left="0" w:firstLine="0"/>
+            </w:pPr>
+            <w:r>
+              <w:rPr>
+                <w:rFonts w:ascii="맑은 고딕" w:hAnsi="맑은 고딕" w:eastAsia="맑은 고딕"/>
+                <w:color w:val="000000"/>
+                <w:sz w:val="30"/>
+              </w:rPr>
+              <w:t>고구마(국산,왕,10k) 2박스</w:t>
+            </w:r>
+          </w:p>
+          <w:p>
+            <w:pPr>
+              <w:spacing w:before="20" w:after="20" w:line="360" w:lineRule="exact"/>
+              <w:ind w:left="0" w:firstLine="0"/>
+            </w:pPr>
+            <w:r>
+              <w:rPr>
+                <w:rFonts w:ascii="맑은 고딕" w:hAnsi="맑은 고딕" w:eastAsia="맑은 고딕"/>
+                <w:color w:val="000000"/>
+                <w:sz w:val="30"/>
+              </w:rPr>
+              <w:t>우엉(국산,4k) 5관</w:t>
             </w:r>
           </w:p>
         </w:tc>
@@ -273,7 +596,7 @@
                 <w:color w:val="000000"/>
                 <w:sz w:val="30"/>
               </w:rPr>
-              <w:t>-부엉이산장 강남점</w:t>
+              <w:t>-고른햇살</w:t>
             </w:r>
           </w:p>
           <w:p>
@@ -284,10 +607,10 @@
             <w:r>
               <w:rPr>
                 <w:rFonts w:ascii="맑은 고딕" w:hAnsi="맑은 고딕" w:eastAsia="맑은 고딕"/>
-                <w:color w:val="0000FF"/>
-                <w:sz w:val="30"/>
-              </w:rPr>
-              <w:t>감자 15kg</w:t>
+                <w:color w:val="000000"/>
+                <w:sz w:val="30"/>
+              </w:rPr>
+              <w:t>쑥갓 2박스(박스확인필요)</w:t>
             </w:r>
           </w:p>
           <w:p>
@@ -301,7 +624,7 @@
                 <w:color w:val="000000"/>
                 <w:sz w:val="30"/>
               </w:rPr>
-              <w:t>깐양파 7kg</w:t>
+              <w:t>일자콩나물 1박스</w:t>
             </w:r>
           </w:p>
           <w:p>
@@ -315,49 +638,7 @@
                 <w:color w:val="000000"/>
                 <w:sz w:val="30"/>
               </w:rPr>
-              <w:t>배추 1통</w:t>
-            </w:r>
-          </w:p>
-          <w:p>
-            <w:pPr>
-              <w:spacing w:before="20" w:after="20" w:line="360" w:lineRule="exact"/>
-              <w:ind w:left="0" w:firstLine="0"/>
-            </w:pPr>
-            <w:r>
-              <w:rPr>
-                <w:rFonts w:ascii="맑은 고딕" w:hAnsi="맑은 고딕" w:eastAsia="맑은 고딕"/>
-                <w:color w:val="000000"/>
-                <w:sz w:val="30"/>
-              </w:rPr>
-              <w:t>깐쪽파 1kg</w:t>
-            </w:r>
-          </w:p>
-          <w:p>
-            <w:pPr>
-              <w:spacing w:before="20" w:after="20" w:line="360" w:lineRule="exact"/>
-              <w:ind w:left="0" w:firstLine="0"/>
-            </w:pPr>
-            <w:r>
-              <w:rPr>
-                <w:rFonts w:ascii="맑은 고딕" w:hAnsi="맑은 고딕" w:eastAsia="맑은 고딕"/>
-                <w:color w:val="000000"/>
-                <w:sz w:val="30"/>
-              </w:rPr>
-              <w:t>깐대파 5kg</w:t>
-            </w:r>
-          </w:p>
-          <w:p>
-            <w:pPr>
-              <w:spacing w:before="20" w:after="20" w:line="360" w:lineRule="exact"/>
-              <w:ind w:left="0" w:firstLine="0"/>
-            </w:pPr>
-            <w:r>
-              <w:rPr>
-                <w:rFonts w:ascii="맑은 고딕" w:hAnsi="맑은 고딕" w:eastAsia="맑은 고딕"/>
-                <w:color w:val="FF0000"/>
-                <w:sz w:val="30"/>
-              </w:rPr>
-              <w:t>청양고추 1kg</w:t>
+              <w:t>깐양배추45 1망</w:t>
             </w:r>
           </w:p>
           <w:p>
@@ -372,7 +653,7 @@
                 <w:color w:val="000000"/>
                 <w:sz w:val="30"/>
               </w:rPr>
-              <w:t>-부엉이산장 마곡점</w:t>
+              <w:t>-선데이버거클럽</w:t>
             </w:r>
           </w:p>
           <w:p>
@@ -383,10 +664,10 @@
             <w:r>
               <w:rPr>
                 <w:rFonts w:ascii="맑은 고딕" w:hAnsi="맑은 고딕" w:eastAsia="맑은 고딕"/>
-                <w:color w:val="FF0000"/>
-                <w:sz w:val="30"/>
-              </w:rPr>
-              <w:t>팽이 5개</w:t>
+                <w:color w:val="000000"/>
+                <w:sz w:val="30"/>
+              </w:rPr>
+              <w:t>완숙토마토1호 2박스</w:t>
             </w:r>
           </w:p>
           <w:p>
@@ -397,10 +678,10 @@
             <w:r>
               <w:rPr>
                 <w:rFonts w:ascii="맑은 고딕" w:hAnsi="맑은 고딕" w:eastAsia="맑은 고딕"/>
-                <w:color w:val="FF0000"/>
-                <w:sz w:val="30"/>
-              </w:rPr>
-              <w:t>세척당근 2kg</w:t>
+                <w:color w:val="000000"/>
+                <w:sz w:val="30"/>
+              </w:rPr>
+              <w:t>딜 2팩</w:t>
             </w:r>
           </w:p>
           <w:p>
@@ -411,66 +692,10 @@
             <w:r>
               <w:rPr>
                 <w:rFonts w:ascii="맑은 고딕" w:hAnsi="맑은 고딕" w:eastAsia="맑은 고딕"/>
-                <w:color w:val="FF0000"/>
-                <w:sz w:val="30"/>
-              </w:rPr>
-              <w:t>애호박 2kg</w:t>
-            </w:r>
-          </w:p>
-          <w:p>
-            <w:pPr>
-              <w:spacing w:before="20" w:after="20" w:line="360" w:lineRule="exact"/>
-              <w:ind w:left="0" w:firstLine="0"/>
-            </w:pPr>
-            <w:r>
-              <w:rPr>
-                <w:rFonts w:ascii="맑은 고딕" w:hAnsi="맑은 고딕" w:eastAsia="맑은 고딕"/>
-                <w:color w:val="FF0000"/>
-                <w:sz w:val="30"/>
-              </w:rPr>
-              <w:t>청양고추 2kg</w:t>
-            </w:r>
-          </w:p>
-          <w:p>
-            <w:pPr>
-              <w:spacing w:before="20" w:after="20" w:line="360" w:lineRule="exact"/>
-              <w:ind w:left="0" w:firstLine="0"/>
-            </w:pPr>
-            <w:r>
-              <w:rPr>
-                <w:rFonts w:ascii="맑은 고딕" w:hAnsi="맑은 고딕" w:eastAsia="맑은 고딕"/>
                 <w:color w:val="000000"/>
                 <w:sz w:val="30"/>
               </w:rPr>
-              <w:t>곱슬이콩나물 1박스</w:t>
-            </w:r>
-          </w:p>
-          <w:p>
-            <w:pPr>
-              <w:spacing w:before="20" w:after="20" w:line="360" w:lineRule="exact"/>
-              <w:ind w:left="0" w:firstLine="0"/>
-            </w:pPr>
-            <w:r>
-              <w:rPr>
-                <w:rFonts w:ascii="맑은 고딕" w:hAnsi="맑은 고딕" w:eastAsia="맑은 고딕"/>
-                <w:color w:val="FF0000"/>
-                <w:sz w:val="30"/>
-              </w:rPr>
-              <w:t>맛느타리 2팩</w:t>
-            </w:r>
-          </w:p>
-          <w:p>
-            <w:pPr>
-              <w:spacing w:before="20" w:after="20" w:line="360" w:lineRule="exact"/>
-              <w:ind w:left="0" w:firstLine="0"/>
-            </w:pPr>
-            <w:r>
-              <w:rPr>
-                <w:rFonts w:ascii="맑은 고딕" w:hAnsi="맑은 고딕" w:eastAsia="맑은 고딕"/>
-                <w:color w:val="000000"/>
-                <w:sz w:val="30"/>
-              </w:rPr>
-              <w:t>깐대파 5kg</w:t>
+              <w:t>잎로메인 1박스</w:t>
             </w:r>
           </w:p>
           <w:p>
@@ -485,7 +710,7 @@
                 <w:color w:val="000000"/>
                 <w:sz w:val="30"/>
               </w:rPr>
-              <w:t>-샤브야키 주안점</w:t>
+              <w:t>-오레노이키루미치 압구정점</w:t>
             </w:r>
           </w:p>
           <w:p>
@@ -499,7 +724,7 @@
                 <w:color w:val="000000"/>
                 <w:sz w:val="30"/>
               </w:rPr>
-              <w:t>숙주 6박스</w:t>
+              <w:t>굵은숙주 8박스</w:t>
             </w:r>
           </w:p>
           <w:p>
@@ -513,7 +738,22 @@
                 <w:color w:val="000000"/>
                 <w:sz w:val="30"/>
               </w:rPr>
-              <w:t>청경채 2박스</w:t>
+              <w:t>흙대파 2단</w:t>
+            </w:r>
+          </w:p>
+          <w:p>
+            <w:pPr>
+              <w:spacing w:before="300" w:after="20" w:line="360" w:lineRule="exact"/>
+              <w:ind w:left="0" w:firstLine="0"/>
+            </w:pPr>
+            <w:r>
+              <w:rPr>
+                <w:rFonts w:ascii="맑은 고딕" w:hAnsi="맑은 고딕" w:eastAsia="맑은 고딕"/>
+                <w:b/>
+                <w:color w:val="000000"/>
+                <w:sz w:val="30"/>
+              </w:rPr>
+              <w:t>-부엉이산장 강남점</w:t>
             </w:r>
           </w:p>
           <w:p>
@@ -524,10 +764,24 @@
             <w:r>
               <w:rPr>
                 <w:rFonts w:ascii="맑은 고딕" w:hAnsi="맑은 고딕" w:eastAsia="맑은 고딕"/>
+                <w:color w:val="0000FF"/>
+                <w:sz w:val="30"/>
+              </w:rPr>
+              <w:t>감자 15kg</w:t>
+            </w:r>
+          </w:p>
+          <w:p>
+            <w:pPr>
+              <w:spacing w:before="20" w:after="20" w:line="360" w:lineRule="exact"/>
+              <w:ind w:left="0" w:firstLine="0"/>
+            </w:pPr>
+            <w:r>
+              <w:rPr>
+                <w:rFonts w:ascii="맑은 고딕" w:hAnsi="맑은 고딕" w:eastAsia="맑은 고딕"/>
                 <w:color w:val="000000"/>
                 <w:sz w:val="30"/>
               </w:rPr>
-              <w:t>팽이 2박스</w:t>
+              <w:t>깐양파 7kg</w:t>
             </w:r>
           </w:p>
           <w:p>
@@ -538,80 +792,24 @@
             <w:r>
               <w:rPr>
                 <w:rFonts w:ascii="맑은 고딕" w:hAnsi="맑은 고딕" w:eastAsia="맑은 고딕"/>
+                <w:color w:val="FF0000"/>
+                <w:sz w:val="30"/>
+              </w:rPr>
+              <w:t>세척당근 2kg</w:t>
+            </w:r>
+          </w:p>
+          <w:p>
+            <w:pPr>
+              <w:spacing w:before="20" w:after="20" w:line="360" w:lineRule="exact"/>
+              <w:ind w:left="0" w:firstLine="0"/>
+            </w:pPr>
+            <w:r>
+              <w:rPr>
+                <w:rFonts w:ascii="맑은 고딕" w:hAnsi="맑은 고딕" w:eastAsia="맑은 고딕"/>
                 <w:color w:val="000000"/>
                 <w:sz w:val="30"/>
               </w:rPr>
-              <w:t>꽃느타리 1박스</w:t>
-            </w:r>
-          </w:p>
-          <w:p>
-            <w:pPr>
-              <w:spacing w:before="20" w:after="20" w:line="360" w:lineRule="exact"/>
-              <w:ind w:left="0" w:firstLine="0"/>
-            </w:pPr>
-            <w:r>
-              <w:rPr>
-                <w:rFonts w:ascii="맑은 고딕" w:hAnsi="맑은 고딕" w:eastAsia="맑은 고딕"/>
-                <w:color w:val="FF0000"/>
-                <w:sz w:val="30"/>
-              </w:rPr>
-              <w:t>쌀 1포</w:t>
-            </w:r>
-          </w:p>
-          <w:p>
-            <w:pPr>
-              <w:spacing w:before="20" w:after="20" w:line="360" w:lineRule="exact"/>
-              <w:ind w:left="0" w:firstLine="0"/>
-            </w:pPr>
-            <w:r>
-              <w:rPr>
-                <w:rFonts w:ascii="맑은 고딕" w:hAnsi="맑은 고딕" w:eastAsia="맑은 고딕"/>
-                <w:color w:val="000000"/>
-                <w:sz w:val="30"/>
-              </w:rPr>
               <w:t>깐쪽파 1kg</w:t>
-            </w:r>
-          </w:p>
-          <w:p>
-            <w:pPr>
-              <w:spacing w:before="20" w:after="20" w:line="360" w:lineRule="exact"/>
-              <w:ind w:left="0" w:firstLine="0"/>
-            </w:pPr>
-            <w:r>
-              <w:rPr>
-                <w:rFonts w:ascii="맑은 고딕" w:hAnsi="맑은 고딕" w:eastAsia="맑은 고딕"/>
-                <w:color w:val="0000FF"/>
-                <w:sz w:val="30"/>
-              </w:rPr>
-              <w:t>새싹(대) 2팩</w:t>
-            </w:r>
-          </w:p>
-          <w:p>
-            <w:pPr>
-              <w:spacing w:before="20" w:after="20" w:line="360" w:lineRule="exact"/>
-              <w:ind w:left="0" w:firstLine="0"/>
-            </w:pPr>
-            <w:r>
-              <w:rPr>
-                <w:rFonts w:ascii="맑은 고딕" w:hAnsi="맑은 고딕" w:eastAsia="맑은 고딕"/>
-                <w:color w:val="000000"/>
-                <w:sz w:val="30"/>
-              </w:rPr>
-              <w:t>근대 1박스</w:t>
-            </w:r>
-          </w:p>
-          <w:p>
-            <w:pPr>
-              <w:spacing w:before="20" w:after="20" w:line="360" w:lineRule="exact"/>
-              <w:ind w:left="0" w:firstLine="0"/>
-            </w:pPr>
-            <w:r>
-              <w:rPr>
-                <w:rFonts w:ascii="맑은 고딕" w:hAnsi="맑은 고딕" w:eastAsia="맑은 고딕"/>
-                <w:color w:val="000000"/>
-                <w:sz w:val="30"/>
-              </w:rPr>
-              <w:t>돌미나리 1박스</w:t>
             </w:r>
           </w:p>
         </w:tc>
@@ -637,7 +835,7 @@
                 <w:color w:val="000000"/>
                 <w:sz w:val="30"/>
               </w:rPr>
-              <w:t>-부엉이산장 구월점</w:t>
+              <w:t>-부엉이산장 마곡점</w:t>
             </w:r>
           </w:p>
           <w:p>
@@ -651,7 +849,7 @@
                 <w:color w:val="000000"/>
                 <w:sz w:val="30"/>
               </w:rPr>
-              <w:t>미나리 3kg</w:t>
+              <w:t>간마늘(대) 3kg</w:t>
             </w:r>
           </w:p>
           <w:p>
@@ -665,7 +863,7 @@
                 <w:color w:val="000000"/>
                 <w:sz w:val="30"/>
               </w:rPr>
-              <w:t>깐쪽파 1kg</w:t>
+              <w:t>깐마늘(대) 0.5kg</w:t>
             </w:r>
           </w:p>
           <w:p>
@@ -679,7 +877,7 @@
                 <w:color w:val="FF0000"/>
                 <w:sz w:val="30"/>
               </w:rPr>
-              <w:t>감자 10kg</w:t>
+              <w:t>팽이 15개</w:t>
             </w:r>
           </w:p>
           <w:p>
@@ -693,7 +891,7 @@
                 <w:color w:val="000000"/>
                 <w:sz w:val="30"/>
               </w:rPr>
-              <w:t>맛느타리 1박스</w:t>
+              <w:t>레몬 15개</w:t>
             </w:r>
           </w:p>
           <w:p>
@@ -707,7 +905,7 @@
                 <w:color w:val="000000"/>
                 <w:sz w:val="30"/>
               </w:rPr>
-              <w:t>새송이 1박스</w:t>
+              <w:t>미나리 5kg</w:t>
             </w:r>
           </w:p>
           <w:p>
@@ -718,10 +916,277 @@
             <w:r>
               <w:rPr>
                 <w:rFonts w:ascii="맑은 고딕" w:hAnsi="맑은 고딕" w:eastAsia="맑은 고딕"/>
+                <w:color w:val="000000"/>
+                <w:sz w:val="30"/>
+              </w:rPr>
+              <w:t>깐쪽파 2kg</w:t>
+            </w:r>
+          </w:p>
+          <w:p>
+            <w:pPr>
+              <w:spacing w:before="20" w:after="20" w:line="360" w:lineRule="exact"/>
+              <w:ind w:left="0" w:firstLine="0"/>
+            </w:pPr>
+            <w:r>
+              <w:rPr>
+                <w:rFonts w:ascii="맑은 고딕" w:hAnsi="맑은 고딕" w:eastAsia="맑은 고딕"/>
+                <w:color w:val="000000"/>
+                <w:sz w:val="30"/>
+              </w:rPr>
+              <w:t>깐양파 5kg</w:t>
+            </w:r>
+          </w:p>
+          <w:p>
+            <w:pPr>
+              <w:spacing w:before="20" w:after="20" w:line="360" w:lineRule="exact"/>
+              <w:ind w:left="0" w:firstLine="0"/>
+            </w:pPr>
+            <w:r>
+              <w:rPr>
+                <w:rFonts w:ascii="맑은 고딕" w:hAnsi="맑은 고딕" w:eastAsia="맑은 고딕"/>
+                <w:color w:val="000000"/>
+                <w:sz w:val="30"/>
+              </w:rPr>
+              <w:t>꽈리고추 1kg</w:t>
+            </w:r>
+          </w:p>
+          <w:p>
+            <w:pPr>
+              <w:spacing w:before="20" w:after="20" w:line="360" w:lineRule="exact"/>
+              <w:ind w:left="0" w:firstLine="0"/>
+            </w:pPr>
+            <w:r>
+              <w:rPr>
+                <w:rFonts w:ascii="맑은 고딕" w:hAnsi="맑은 고딕" w:eastAsia="맑은 고딕"/>
                 <w:color w:val="FF0000"/>
                 <w:sz w:val="30"/>
               </w:rPr>
-              <w:t>청양고추 0.5k</w:t>
+              <w:t>청양고추 1kg</w:t>
+            </w:r>
+          </w:p>
+          <w:p>
+            <w:pPr>
+              <w:spacing w:before="20" w:after="20" w:line="360" w:lineRule="exact"/>
+              <w:ind w:left="0" w:firstLine="0"/>
+            </w:pPr>
+            <w:r>
+              <w:rPr>
+                <w:rFonts w:ascii="맑은 고딕" w:hAnsi="맑은 고딕" w:eastAsia="맑은 고딕"/>
+                <w:color w:val="000000"/>
+                <w:sz w:val="30"/>
+              </w:rPr>
+              <w:t>깐대파 5kg</w:t>
+            </w:r>
+          </w:p>
+          <w:p>
+            <w:pPr>
+              <w:spacing w:before="20" w:after="20" w:line="360" w:lineRule="exact"/>
+              <w:ind w:left="0" w:firstLine="0"/>
+            </w:pPr>
+            <w:r>
+              <w:rPr>
+                <w:rFonts w:ascii="맑은 고딕" w:hAnsi="맑은 고딕" w:eastAsia="맑은 고딕"/>
+                <w:color w:val="000000"/>
+                <w:sz w:val="30"/>
+              </w:rPr>
+              <w:t>감자 1박스</w:t>
+            </w:r>
+          </w:p>
+          <w:p>
+            <w:pPr>
+              <w:spacing w:before="20" w:after="20" w:line="360" w:lineRule="exact"/>
+              <w:ind w:left="0" w:firstLine="0"/>
+            </w:pPr>
+            <w:r>
+              <w:rPr>
+                <w:rFonts w:ascii="맑은 고딕" w:hAnsi="맑은 고딕" w:eastAsia="맑은 고딕"/>
+                <w:color w:val="000000"/>
+                <w:sz w:val="30"/>
+              </w:rPr>
+              <w:t>무 2통</w:t>
+            </w:r>
+          </w:p>
+          <w:p>
+            <w:pPr>
+              <w:spacing w:before="300" w:after="20" w:line="360" w:lineRule="exact"/>
+              <w:ind w:left="0" w:firstLine="0"/>
+            </w:pPr>
+            <w:r>
+              <w:rPr>
+                <w:rFonts w:ascii="맑은 고딕" w:hAnsi="맑은 고딕" w:eastAsia="맑은 고딕"/>
+                <w:b/>
+                <w:color w:val="000000"/>
+                <w:sz w:val="30"/>
+              </w:rPr>
+              <w:t>-샤브야키 주안점</w:t>
+            </w:r>
+          </w:p>
+          <w:p>
+            <w:pPr>
+              <w:spacing w:before="20" w:after="20" w:line="360" w:lineRule="exact"/>
+              <w:ind w:left="0" w:firstLine="0"/>
+            </w:pPr>
+            <w:r>
+              <w:rPr>
+                <w:rFonts w:ascii="맑은 고딕" w:hAnsi="맑은 고딕" w:eastAsia="맑은 고딕"/>
+                <w:color w:val="000000"/>
+                <w:sz w:val="30"/>
+              </w:rPr>
+              <w:t>숙주 6박스</w:t>
+            </w:r>
+          </w:p>
+          <w:p>
+            <w:pPr>
+              <w:spacing w:before="20" w:after="20" w:line="360" w:lineRule="exact"/>
+              <w:ind w:left="0" w:firstLine="0"/>
+            </w:pPr>
+            <w:r>
+              <w:rPr>
+                <w:rFonts w:ascii="맑은 고딕" w:hAnsi="맑은 고딕" w:eastAsia="맑은 고딕"/>
+                <w:color w:val="000000"/>
+                <w:sz w:val="30"/>
+              </w:rPr>
+              <w:t>배추 1망</w:t>
+            </w:r>
+          </w:p>
+          <w:p>
+            <w:pPr>
+              <w:spacing w:before="20" w:after="20" w:line="360" w:lineRule="exact"/>
+              <w:ind w:left="0" w:firstLine="0"/>
+            </w:pPr>
+            <w:r>
+              <w:rPr>
+                <w:rFonts w:ascii="맑은 고딕" w:hAnsi="맑은 고딕" w:eastAsia="맑은 고딕"/>
+                <w:color w:val="000000"/>
+                <w:sz w:val="30"/>
+              </w:rPr>
+              <w:t>청경채 3박스</w:t>
+            </w:r>
+          </w:p>
+          <w:p>
+            <w:pPr>
+              <w:spacing w:before="20" w:after="20" w:line="360" w:lineRule="exact"/>
+              <w:ind w:left="0" w:firstLine="0"/>
+            </w:pPr>
+            <w:r>
+              <w:rPr>
+                <w:rFonts w:ascii="맑은 고딕" w:hAnsi="맑은 고딕" w:eastAsia="맑은 고딕"/>
+                <w:color w:val="000000"/>
+                <w:sz w:val="30"/>
+              </w:rPr>
+              <w:t>깐대파 10KG</w:t>
+            </w:r>
+          </w:p>
+          <w:p>
+            <w:pPr>
+              <w:spacing w:before="20" w:after="20" w:line="360" w:lineRule="exact"/>
+              <w:ind w:left="0" w:firstLine="0"/>
+            </w:pPr>
+            <w:r>
+              <w:rPr>
+                <w:rFonts w:ascii="맑은 고딕" w:hAnsi="맑은 고딕" w:eastAsia="맑은 고딕"/>
+                <w:color w:val="000000"/>
+                <w:sz w:val="30"/>
+              </w:rPr>
+              <w:t>새송이 4박스</w:t>
+            </w:r>
+          </w:p>
+          <w:p>
+            <w:pPr>
+              <w:spacing w:before="20" w:after="20" w:line="360" w:lineRule="exact"/>
+              <w:ind w:left="0" w:firstLine="0"/>
+            </w:pPr>
+            <w:r>
+              <w:rPr>
+                <w:rFonts w:ascii="맑은 고딕" w:hAnsi="맑은 고딕" w:eastAsia="맑은 고딕"/>
+                <w:color w:val="000000"/>
+                <w:sz w:val="30"/>
+              </w:rPr>
+              <w:t>팽이 2박스</w:t>
+            </w:r>
+          </w:p>
+          <w:p>
+            <w:pPr>
+              <w:spacing w:before="20" w:after="20" w:line="360" w:lineRule="exact"/>
+              <w:ind w:left="0" w:firstLine="0"/>
+            </w:pPr>
+            <w:r>
+              <w:rPr>
+                <w:rFonts w:ascii="맑은 고딕" w:hAnsi="맑은 고딕" w:eastAsia="맑은 고딕"/>
+                <w:color w:val="000000"/>
+                <w:sz w:val="30"/>
+              </w:rPr>
+              <w:t>꽃느타리 3박스</w:t>
+            </w:r>
+          </w:p>
+          <w:p>
+            <w:pPr>
+              <w:spacing w:before="20" w:after="20" w:line="360" w:lineRule="exact"/>
+              <w:ind w:left="0" w:firstLine="0"/>
+            </w:pPr>
+            <w:r>
+              <w:rPr>
+                <w:rFonts w:ascii="맑은 고딕" w:hAnsi="맑은 고딕" w:eastAsia="맑은 고딕"/>
+                <w:color w:val="000000"/>
+                <w:sz w:val="30"/>
+              </w:rPr>
+              <w:t>표고버섯2L 1박스</w:t>
+            </w:r>
+          </w:p>
+          <w:p>
+            <w:pPr>
+              <w:spacing w:before="20" w:after="20" w:line="360" w:lineRule="exact"/>
+              <w:ind w:left="0" w:firstLine="0"/>
+            </w:pPr>
+            <w:r>
+              <w:rPr>
+                <w:rFonts w:ascii="맑은 고딕" w:hAnsi="맑은 고딕" w:eastAsia="맑은 고딕"/>
+                <w:color w:val="000000"/>
+                <w:sz w:val="30"/>
+              </w:rPr>
+              <w:t>깐양파 20KG</w:t>
+            </w:r>
+          </w:p>
+          <w:p>
+            <w:pPr>
+              <w:spacing w:before="20" w:after="20" w:line="360" w:lineRule="exact"/>
+              <w:ind w:left="0" w:firstLine="0"/>
+            </w:pPr>
+            <w:r>
+              <w:rPr>
+                <w:rFonts w:ascii="맑은 고딕" w:hAnsi="맑은 고딕" w:eastAsia="맑은 고딕"/>
+                <w:color w:val="000000"/>
+                <w:sz w:val="30"/>
+              </w:rPr>
+              <w:t>깻잎(1k) 1박스</w:t>
+            </w:r>
+          </w:p>
+          <w:p>
+            <w:pPr>
+              <w:spacing w:before="20" w:after="20" w:line="360" w:lineRule="exact"/>
+              <w:ind w:left="0" w:firstLine="0"/>
+            </w:pPr>
+            <w:r>
+              <w:rPr>
+                <w:rFonts w:ascii="맑은 고딕" w:hAnsi="맑은 고딕" w:eastAsia="맑은 고딕"/>
+                <w:color w:val="000000"/>
+                <w:sz w:val="30"/>
+              </w:rPr>
+              <w:t>깐마늘(대) 4KG</w:t>
+            </w:r>
+          </w:p>
+          <w:p>
+            <w:pPr>
+              <w:spacing w:before="20" w:after="20" w:line="360" w:lineRule="exact"/>
+              <w:ind w:left="0" w:firstLine="0"/>
+            </w:pPr>
+            <w:r>
+              <w:rPr>
+                <w:rFonts w:ascii="맑은 고딕" w:hAnsi="맑은 고딕" w:eastAsia="맑은 고딕"/>
+                <w:color w:val="000000"/>
+                <w:sz w:val="30"/>
+              </w:rPr>
+              <w:t>중란 2판</w:t>
             </w:r>
           </w:p>
         </w:tc>
@@ -770,7 +1235,7 @@
                 <w:color w:val="000000"/>
                 <w:sz w:val="30"/>
               </w:rPr>
-              <w:t>-오레노이키루미치 하남점</w:t>
+              <w:t>-브럭시</w:t>
             </w:r>
           </w:p>
           <w:p>
@@ -784,7 +1249,7 @@
                 <w:color w:val="000000"/>
                 <w:sz w:val="30"/>
               </w:rPr>
-              <w:t>굵은숙주 20박스</w:t>
+              <w:t>양상추 10통</w:t>
             </w:r>
           </w:p>
           <w:p>
@@ -798,7 +1263,49 @@
                 <w:color w:val="000000"/>
                 <w:sz w:val="30"/>
               </w:rPr>
-              <w:t>깐양파 10KG</w:t>
+              <w:t>깐양배추42 2통</w:t>
+            </w:r>
+          </w:p>
+          <w:p>
+            <w:pPr>
+              <w:spacing w:before="20" w:after="20" w:line="360" w:lineRule="exact"/>
+              <w:ind w:left="0" w:firstLine="0"/>
+            </w:pPr>
+            <w:r>
+              <w:rPr>
+                <w:rFonts w:ascii="맑은 고딕" w:hAnsi="맑은 고딕" w:eastAsia="맑은 고딕"/>
+                <w:color w:val="000000"/>
+                <w:sz w:val="30"/>
+              </w:rPr>
+              <w:t>통로메인 1박스</w:t>
+            </w:r>
+          </w:p>
+          <w:p>
+            <w:pPr>
+              <w:spacing w:before="20" w:after="20" w:line="360" w:lineRule="exact"/>
+              <w:ind w:left="0" w:firstLine="0"/>
+            </w:pPr>
+            <w:r>
+              <w:rPr>
+                <w:rFonts w:ascii="맑은 고딕" w:hAnsi="맑은 고딕" w:eastAsia="맑은 고딕"/>
+                <w:color w:val="000000"/>
+                <w:sz w:val="30"/>
+              </w:rPr>
+              <w:t>바나나 1발</w:t>
+            </w:r>
+          </w:p>
+          <w:p>
+            <w:pPr>
+              <w:spacing w:before="20" w:after="20" w:line="360" w:lineRule="exact"/>
+              <w:ind w:left="0" w:firstLine="0"/>
+            </w:pPr>
+            <w:r>
+              <w:rPr>
+                <w:rFonts w:ascii="맑은 고딕" w:hAnsi="맑은 고딕" w:eastAsia="맑은 고딕"/>
+                <w:color w:val="000000"/>
+                <w:sz w:val="30"/>
+              </w:rPr>
+              <w:t>중숙아보카도 5개</w:t>
             </w:r>
           </w:p>
           <w:p>
@@ -813,7 +1320,7 @@
                 <w:color w:val="000000"/>
                 <w:sz w:val="30"/>
               </w:rPr>
-              <w:t>-샤브야키 분당점</w:t>
+              <w:t>-샤브야키 평택점</w:t>
             </w:r>
           </w:p>
           <w:p>
@@ -827,7 +1334,7 @@
                 <w:color w:val="000000"/>
                 <w:sz w:val="30"/>
               </w:rPr>
-              <w:t>배추 2망</w:t>
+              <w:t>숙주 2박스</w:t>
             </w:r>
           </w:p>
           <w:p>
@@ -841,7 +1348,7 @@
                 <w:color w:val="000000"/>
                 <w:sz w:val="30"/>
               </w:rPr>
-              <w:t>취청오이(특) 1박스</w:t>
+              <w:t>배추 1망</w:t>
             </w:r>
           </w:p>
           <w:p>
@@ -852,10 +1359,10 @@
             <w:r>
               <w:rPr>
                 <w:rFonts w:ascii="맑은 고딕" w:hAnsi="맑은 고딕" w:eastAsia="맑은 고딕"/>
-                <w:color w:val="0000FF"/>
-                <w:sz w:val="30"/>
-              </w:rPr>
-              <w:t>청양고추 5kg</w:t>
+                <w:color w:val="000000"/>
+                <w:sz w:val="30"/>
+              </w:rPr>
+              <w:t>쑥갓 1박스</w:t>
             </w:r>
           </w:p>
           <w:p>
@@ -883,7 +1390,7 @@
                 <w:color w:val="000000"/>
                 <w:sz w:val="30"/>
               </w:rPr>
-              <w:t>깐양파 10kg</w:t>
+              <w:t>팽이 1박스</w:t>
             </w:r>
           </w:p>
           <w:p>
@@ -897,7 +1404,7 @@
                 <w:color w:val="000000"/>
                 <w:sz w:val="30"/>
               </w:rPr>
-              <w:t>청경채 4박스</w:t>
+              <w:t>꽃느타리 2박스</w:t>
             </w:r>
           </w:p>
           <w:p>
@@ -911,6 +1418,20 @@
                 <w:color w:val="000000"/>
                 <w:sz w:val="30"/>
               </w:rPr>
+              <w:t>청양고추 1박스</w:t>
+            </w:r>
+          </w:p>
+          <w:p>
+            <w:pPr>
+              <w:spacing w:before="20" w:after="20" w:line="360" w:lineRule="exact"/>
+              <w:ind w:left="0" w:firstLine="0"/>
+            </w:pPr>
+            <w:r>
+              <w:rPr>
+                <w:rFonts w:ascii="맑은 고딕" w:hAnsi="맑은 고딕" w:eastAsia="맑은 고딕"/>
+                <w:color w:val="000000"/>
+                <w:sz w:val="30"/>
+              </w:rPr>
               <w:t>깻잎(1k) 1박스</w:t>
             </w:r>
           </w:p>
@@ -925,7 +1446,7 @@
                 <w:color w:val="000000"/>
                 <w:sz w:val="30"/>
               </w:rPr>
-              <w:t>새송이 2박스</w:t>
+              <w:t>깐쪽파 1단</w:t>
             </w:r>
           </w:p>
           <w:p>
@@ -939,119 +1460,7 @@
                 <w:color w:val="000000"/>
                 <w:sz w:val="30"/>
               </w:rPr>
-              <w:t>꽃느타리 2박스</w:t>
-            </w:r>
-          </w:p>
-          <w:p>
-            <w:pPr>
-              <w:spacing w:before="20" w:after="20" w:line="360" w:lineRule="exact"/>
-              <w:ind w:left="0" w:firstLine="0"/>
-            </w:pPr>
-            <w:r>
-              <w:rPr>
-                <w:rFonts w:ascii="맑은 고딕" w:hAnsi="맑은 고딕" w:eastAsia="맑은 고딕"/>
-                <w:color w:val="000000"/>
-                <w:sz w:val="30"/>
-              </w:rPr>
-              <w:t>팽이 2박스</w:t>
-            </w:r>
-          </w:p>
-          <w:p>
-            <w:pPr>
-              <w:spacing w:before="20" w:after="20" w:line="360" w:lineRule="exact"/>
-              <w:ind w:left="0" w:firstLine="0"/>
-            </w:pPr>
-            <w:r>
-              <w:rPr>
-                <w:rFonts w:ascii="맑은 고딕" w:hAnsi="맑은 고딕" w:eastAsia="맑은 고딕"/>
-                <w:color w:val="000000"/>
-                <w:sz w:val="30"/>
-              </w:rPr>
-              <w:t>표고버섯2L 2박스</w:t>
-            </w:r>
-          </w:p>
-          <w:p>
-            <w:pPr>
-              <w:spacing w:before="20" w:after="20" w:line="360" w:lineRule="exact"/>
-              <w:ind w:left="0" w:firstLine="0"/>
-            </w:pPr>
-            <w:r>
-              <w:rPr>
-                <w:rFonts w:ascii="맑은 고딕" w:hAnsi="맑은 고딕" w:eastAsia="맑은 고딕"/>
-                <w:color w:val="000000"/>
-                <w:sz w:val="30"/>
-              </w:rPr>
-              <w:t>근대 1박스</w:t>
-            </w:r>
-          </w:p>
-          <w:p>
-            <w:pPr>
-              <w:spacing w:before="20" w:after="20" w:line="360" w:lineRule="exact"/>
-              <w:ind w:left="0" w:firstLine="0"/>
-            </w:pPr>
-            <w:r>
-              <w:rPr>
-                <w:rFonts w:ascii="맑은 고딕" w:hAnsi="맑은 고딕" w:eastAsia="맑은 고딕"/>
-                <w:color w:val="000000"/>
-                <w:sz w:val="30"/>
-              </w:rPr>
-              <w:t>돌미나리 1박스</w:t>
-            </w:r>
-          </w:p>
-          <w:p>
-            <w:pPr>
-              <w:spacing w:before="20" w:after="20" w:line="360" w:lineRule="exact"/>
-              <w:ind w:left="0" w:firstLine="0"/>
-            </w:pPr>
-            <w:r>
-              <w:rPr>
-                <w:rFonts w:ascii="맑은 고딕" w:hAnsi="맑은 고딕" w:eastAsia="맑은 고딕"/>
-                <w:color w:val="000000"/>
-                <w:sz w:val="30"/>
-              </w:rPr>
-              <w:t>케일 1박스</w:t>
-            </w:r>
-          </w:p>
-          <w:p>
-            <w:pPr>
-              <w:spacing w:before="20" w:after="20" w:line="360" w:lineRule="exact"/>
-              <w:ind w:left="0" w:firstLine="0"/>
-            </w:pPr>
-            <w:r>
-              <w:rPr>
-                <w:rFonts w:ascii="맑은 고딕" w:hAnsi="맑은 고딕" w:eastAsia="맑은 고딕"/>
-                <w:color w:val="000000"/>
-                <w:sz w:val="30"/>
-              </w:rPr>
-              <w:t>중란 10판</w:t>
-            </w:r>
-          </w:p>
-          <w:p>
-            <w:pPr>
-              <w:spacing w:before="20" w:after="20" w:line="360" w:lineRule="exact"/>
-              <w:ind w:left="0" w:firstLine="0"/>
-            </w:pPr>
-            <w:r>
-              <w:rPr>
-                <w:rFonts w:ascii="맑은 고딕" w:hAnsi="맑은 고딕" w:eastAsia="맑은 고딕"/>
-                <w:color w:val="000000"/>
-                <w:sz w:val="30"/>
-              </w:rPr>
-              <w:t>숙주 6박스</w:t>
-            </w:r>
-          </w:p>
-          <w:p>
-            <w:pPr>
-              <w:spacing w:before="20" w:after="20" w:line="360" w:lineRule="exact"/>
-              <w:ind w:left="0" w:firstLine="0"/>
-            </w:pPr>
-            <w:r>
-              <w:rPr>
-                <w:rFonts w:ascii="맑은 고딕" w:hAnsi="맑은 고딕" w:eastAsia="맑은 고딕"/>
-                <w:color w:val="000000"/>
-                <w:sz w:val="30"/>
-              </w:rPr>
-              <w:t>귤 3박스</w:t>
+              <w:t>돌미나리 2박스</w:t>
             </w:r>
           </w:p>
         </w:tc>
@@ -1077,7 +1486,7 @@
                 <w:color w:val="000000"/>
                 <w:sz w:val="30"/>
               </w:rPr>
-              <w:t>-샤브야키 동탄점</w:t>
+              <w:t>-오레노이키루미치 하남점</w:t>
             </w:r>
           </w:p>
           <w:p>
@@ -1091,7 +1500,7 @@
                 <w:color w:val="000000"/>
                 <w:sz w:val="30"/>
               </w:rPr>
-              <w:t>배추 1망</w:t>
+              <w:t>특란 3판</w:t>
             </w:r>
           </w:p>
           <w:p>
@@ -1105,7 +1514,7 @@
                 <w:color w:val="000000"/>
                 <w:sz w:val="30"/>
               </w:rPr>
-              <w:t>양배추45 1망</w:t>
+              <w:t>생강 1박스</w:t>
             </w:r>
           </w:p>
           <w:p>
@@ -1119,7 +1528,7 @@
                 <w:color w:val="000000"/>
                 <w:sz w:val="30"/>
               </w:rPr>
-              <w:t>깻잎(1k) 2박스</w:t>
+              <w:t>깐양파 10kg</w:t>
             </w:r>
           </w:p>
           <w:p>
@@ -1133,119 +1542,7 @@
                 <w:color w:val="000000"/>
                 <w:sz w:val="30"/>
               </w:rPr>
-              <w:t>돌미나리 1박스</w:t>
-            </w:r>
-          </w:p>
-          <w:p>
-            <w:pPr>
-              <w:spacing w:before="20" w:after="20" w:line="360" w:lineRule="exact"/>
-              <w:ind w:left="0" w:firstLine="0"/>
-            </w:pPr>
-            <w:r>
-              <w:rPr>
-                <w:rFonts w:ascii="맑은 고딕" w:hAnsi="맑은 고딕" w:eastAsia="맑은 고딕"/>
-                <w:color w:val="000000"/>
-                <w:sz w:val="30"/>
-              </w:rPr>
-              <w:t>근대 1박스</w:t>
-            </w:r>
-          </w:p>
-          <w:p>
-            <w:pPr>
-              <w:spacing w:before="20" w:after="20" w:line="360" w:lineRule="exact"/>
-              <w:ind w:left="0" w:firstLine="0"/>
-            </w:pPr>
-            <w:r>
-              <w:rPr>
-                <w:rFonts w:ascii="맑은 고딕" w:hAnsi="맑은 고딕" w:eastAsia="맑은 고딕"/>
-                <w:color w:val="000000"/>
-                <w:sz w:val="30"/>
-              </w:rPr>
-              <w:t>쑥갓 1박스</w:t>
-            </w:r>
-          </w:p>
-          <w:p>
-            <w:pPr>
-              <w:spacing w:before="20" w:after="20" w:line="360" w:lineRule="exact"/>
-              <w:ind w:left="0" w:firstLine="0"/>
-            </w:pPr>
-            <w:r>
-              <w:rPr>
-                <w:rFonts w:ascii="맑은 고딕" w:hAnsi="맑은 고딕" w:eastAsia="맑은 고딕"/>
-                <w:color w:val="000000"/>
-                <w:sz w:val="30"/>
-              </w:rPr>
-              <w:t>새송이 2박스</w:t>
-            </w:r>
-          </w:p>
-          <w:p>
-            <w:pPr>
-              <w:spacing w:before="20" w:after="20" w:line="360" w:lineRule="exact"/>
-              <w:ind w:left="0" w:firstLine="0"/>
-            </w:pPr>
-            <w:r>
-              <w:rPr>
-                <w:rFonts w:ascii="맑은 고딕" w:hAnsi="맑은 고딕" w:eastAsia="맑은 고딕"/>
-                <w:color w:val="000000"/>
-                <w:sz w:val="30"/>
-              </w:rPr>
-              <w:t>꽃느타리 2박스</w:t>
-            </w:r>
-          </w:p>
-          <w:p>
-            <w:pPr>
-              <w:spacing w:before="20" w:after="20" w:line="360" w:lineRule="exact"/>
-              <w:ind w:left="0" w:firstLine="0"/>
-            </w:pPr>
-            <w:r>
-              <w:rPr>
-                <w:rFonts w:ascii="맑은 고딕" w:hAnsi="맑은 고딕" w:eastAsia="맑은 고딕"/>
-                <w:color w:val="000000"/>
-                <w:sz w:val="30"/>
-              </w:rPr>
-              <w:t>포기김치 1박스</w:t>
-            </w:r>
-          </w:p>
-          <w:p>
-            <w:pPr>
-              <w:spacing w:before="20" w:after="20" w:line="360" w:lineRule="exact"/>
-              <w:ind w:left="0" w:firstLine="0"/>
-            </w:pPr>
-            <w:r>
-              <w:rPr>
-                <w:rFonts w:ascii="맑은 고딕" w:hAnsi="맑은 고딕" w:eastAsia="맑은 고딕"/>
-                <w:color w:val="000000"/>
-                <w:sz w:val="30"/>
-              </w:rPr>
-              <w:t>숙주 2박스</w:t>
-            </w:r>
-          </w:p>
-          <w:p>
-            <w:pPr>
-              <w:spacing w:before="20" w:after="20" w:line="360" w:lineRule="exact"/>
-              <w:ind w:left="0" w:firstLine="0"/>
-            </w:pPr>
-            <w:r>
-              <w:rPr>
-                <w:rFonts w:ascii="맑은 고딕" w:hAnsi="맑은 고딕" w:eastAsia="맑은 고딕"/>
-                <w:color w:val="000000"/>
-                <w:sz w:val="30"/>
-              </w:rPr>
-              <w:t>부추 1단</w:t>
-            </w:r>
-          </w:p>
-          <w:p>
-            <w:pPr>
-              <w:spacing w:before="20" w:after="20" w:line="360" w:lineRule="exact"/>
-              <w:ind w:left="0" w:firstLine="0"/>
-            </w:pPr>
-            <w:r>
-              <w:rPr>
-                <w:rFonts w:ascii="맑은 고딕" w:hAnsi="맑은 고딕" w:eastAsia="맑은 고딕"/>
-                <w:color w:val="000000"/>
-                <w:sz w:val="30"/>
-              </w:rPr>
-              <w:t>순두부400g 5팩</w:t>
+              <w:t>깐마늘(중) 20kg</w:t>
             </w:r>
           </w:p>
           <w:p>
@@ -1260,7 +1557,7 @@
                 <w:color w:val="000000"/>
                 <w:sz w:val="30"/>
               </w:rPr>
-              <w:t>-동원1차</w:t>
+              <w:t>-샤브야키 분당점</w:t>
             </w:r>
           </w:p>
           <w:p>
@@ -1274,7 +1571,7 @@
                 <w:color w:val="000000"/>
                 <w:sz w:val="30"/>
               </w:rPr>
-              <w:t>감자(왕특) 5kg</w:t>
+              <w:t>배추 1망</w:t>
             </w:r>
           </w:p>
           <w:p>
@@ -1288,7 +1585,7 @@
                 <w:color w:val="000000"/>
                 <w:sz w:val="30"/>
               </w:rPr>
-              <w:t>감자(싼왕왕) 1박스</w:t>
+              <w:t>깐쪽파 2kg</w:t>
             </w:r>
           </w:p>
           <w:p>
@@ -1302,7 +1599,7 @@
                 <w:color w:val="000000"/>
                 <w:sz w:val="30"/>
               </w:rPr>
-              <w:t>청양고추 5kg</w:t>
+              <w:t>청경채 2박스</w:t>
             </w:r>
           </w:p>
           <w:p>
@@ -1316,7 +1613,7 @@
                 <w:color w:val="000000"/>
                 <w:sz w:val="30"/>
               </w:rPr>
-              <w:t>깐양파2호10k 1봉</w:t>
+              <w:t>새송이 4박스</w:t>
             </w:r>
           </w:p>
           <w:p>
@@ -1330,7 +1627,7 @@
                 <w:color w:val="000000"/>
                 <w:sz w:val="30"/>
               </w:rPr>
-              <w:t>깐양파2호5k 6봉</w:t>
+              <w:t>꽃느타리 4박스</w:t>
             </w:r>
           </w:p>
           <w:p>
@@ -1344,7 +1641,7 @@
                 <w:color w:val="000000"/>
                 <w:sz w:val="30"/>
               </w:rPr>
-              <w:t>깐쪽파0.5k 2봉</w:t>
+              <w:t>표고버섯2L 2박스</w:t>
             </w:r>
           </w:p>
           <w:p>
@@ -1358,7 +1655,7 @@
                 <w:color w:val="000000"/>
                 <w:sz w:val="30"/>
               </w:rPr>
-              <w:t>깐대파(대)1kg 5봉</w:t>
+              <w:t>근대 1박스</w:t>
             </w:r>
           </w:p>
           <w:p>
@@ -1372,7 +1669,7 @@
                 <w:color w:val="000000"/>
                 <w:sz w:val="30"/>
               </w:rPr>
-              <w:t>레몬(165과) 1박스 -확인예정</w:t>
+              <w:t>돌미나리 1박스</w:t>
             </w:r>
           </w:p>
           <w:p>
@@ -1386,7 +1683,7 @@
                 <w:color w:val="000000"/>
                 <w:sz w:val="30"/>
               </w:rPr>
-              <w:t>깐마늘(중)0.5k 3봉</w:t>
+              <w:t>케일 1박스</w:t>
             </w:r>
           </w:p>
           <w:p>
@@ -1397,10 +1694,24 @@
             <w:r>
               <w:rPr>
                 <w:rFonts w:ascii="맑은 고딕" w:hAnsi="맑은 고딕" w:eastAsia="맑은 고딕"/>
+                <w:color w:val="FF0000"/>
+                <w:sz w:val="30"/>
+              </w:rPr>
+              <w:t>쌀 2포</w:t>
+            </w:r>
+          </w:p>
+          <w:p>
+            <w:pPr>
+              <w:spacing w:before="20" w:after="20" w:line="360" w:lineRule="exact"/>
+              <w:ind w:left="0" w:firstLine="0"/>
+            </w:pPr>
+            <w:r>
+              <w:rPr>
+                <w:rFonts w:ascii="맑은 고딕" w:hAnsi="맑은 고딕" w:eastAsia="맑은 고딕"/>
                 <w:color w:val="000000"/>
                 <w:sz w:val="30"/>
               </w:rPr>
-              <w:t>팽이 1박스</w:t>
+              <w:t>양상추 10통</w:t>
             </w:r>
           </w:p>
           <w:p>
@@ -1411,52 +1722,10 @@
             <w:r>
               <w:rPr>
                 <w:rFonts w:ascii="맑은 고딕" w:hAnsi="맑은 고딕" w:eastAsia="맑은 고딕"/>
-                <w:color w:val="000000"/>
-                <w:sz w:val="30"/>
-              </w:rPr>
-              <w:t>새송이 1박스</w:t>
-            </w:r>
-          </w:p>
-          <w:p>
-            <w:pPr>
-              <w:spacing w:before="20" w:after="20" w:line="360" w:lineRule="exact"/>
-              <w:ind w:left="0" w:firstLine="0"/>
-            </w:pPr>
-            <w:r>
-              <w:rPr>
-                <w:rFonts w:ascii="맑은 고딕" w:hAnsi="맑은 고딕" w:eastAsia="맑은 고딕"/>
-                <w:color w:val="000000"/>
-                <w:sz w:val="30"/>
-              </w:rPr>
-              <w:t>맛느타리 2박스</w:t>
-            </w:r>
-          </w:p>
-          <w:p>
-            <w:pPr>
-              <w:spacing w:before="20" w:after="20" w:line="360" w:lineRule="exact"/>
-              <w:ind w:left="0" w:firstLine="0"/>
-            </w:pPr>
-            <w:r>
-              <w:rPr>
-                <w:rFonts w:ascii="맑은 고딕" w:hAnsi="맑은 고딕" w:eastAsia="맑은 고딕"/>
-                <w:color w:val="000000"/>
-                <w:sz w:val="30"/>
-              </w:rPr>
-              <w:t>적채 1박스</w:t>
-            </w:r>
-          </w:p>
-          <w:p>
-            <w:pPr>
-              <w:spacing w:before="20" w:after="20" w:line="360" w:lineRule="exact"/>
-              <w:ind w:left="0" w:firstLine="0"/>
-            </w:pPr>
-            <w:r>
-              <w:rPr>
-                <w:rFonts w:ascii="맑은 고딕" w:hAnsi="맑은 고딕" w:eastAsia="맑은 고딕"/>
-                <w:color w:val="000000"/>
-                <w:sz w:val="30"/>
-              </w:rPr>
-              <w:t>청경채 1박스</w:t>
+                <w:color w:val="0000FF"/>
+                <w:sz w:val="30"/>
+              </w:rPr>
+              <w:t>새싹(대) 2팩</w:t>
             </w:r>
           </w:p>
         </w:tc>
@@ -1470,6 +1739,498 @@
               <w:right w:val="single" w:sz="4" w:color="000000"/>
             </w:tcBorders>
           </w:tcPr>
+          <w:p>
+            <w:pPr>
+              <w:spacing w:before="20" w:after="20" w:line="360" w:lineRule="exact"/>
+              <w:ind w:left="0" w:firstLine="0"/>
+            </w:pPr>
+            <w:r>
+              <w:rPr>
+                <w:rFonts w:ascii="맑은 고딕" w:hAnsi="맑은 고딕" w:eastAsia="맑은 고딕"/>
+                <w:b/>
+                <w:color w:val="000000"/>
+                <w:sz w:val="30"/>
+              </w:rPr>
+              <w:t>-샤브야키 동탄점</w:t>
+            </w:r>
+          </w:p>
+          <w:p>
+            <w:pPr>
+              <w:spacing w:before="20" w:after="20" w:line="360" w:lineRule="exact"/>
+              <w:ind w:left="0" w:firstLine="0"/>
+            </w:pPr>
+            <w:r>
+              <w:rPr>
+                <w:rFonts w:ascii="맑은 고딕" w:hAnsi="맑은 고딕" w:eastAsia="맑은 고딕"/>
+                <w:color w:val="000000"/>
+                <w:sz w:val="30"/>
+              </w:rPr>
+              <w:t>배추 2망</w:t>
+            </w:r>
+          </w:p>
+          <w:p>
+            <w:pPr>
+              <w:spacing w:before="20" w:after="20" w:line="360" w:lineRule="exact"/>
+              <w:ind w:left="0" w:firstLine="0"/>
+            </w:pPr>
+            <w:r>
+              <w:rPr>
+                <w:rFonts w:ascii="맑은 고딕" w:hAnsi="맑은 고딕" w:eastAsia="맑은 고딕"/>
+                <w:color w:val="000000"/>
+                <w:sz w:val="30"/>
+              </w:rPr>
+              <w:t>깐양파 10kg</w:t>
+            </w:r>
+          </w:p>
+          <w:p>
+            <w:pPr>
+              <w:spacing w:before="20" w:after="20" w:line="360" w:lineRule="exact"/>
+              <w:ind w:left="0" w:firstLine="0"/>
+            </w:pPr>
+            <w:r>
+              <w:rPr>
+                <w:rFonts w:ascii="맑은 고딕" w:hAnsi="맑은 고딕" w:eastAsia="맑은 고딕"/>
+                <w:color w:val="000000"/>
+                <w:sz w:val="30"/>
+              </w:rPr>
+              <w:t>깐대파 10kg</w:t>
+            </w:r>
+          </w:p>
+          <w:p>
+            <w:pPr>
+              <w:spacing w:before="20" w:after="20" w:line="360" w:lineRule="exact"/>
+              <w:ind w:left="0" w:firstLine="0"/>
+            </w:pPr>
+            <w:r>
+              <w:rPr>
+                <w:rFonts w:ascii="맑은 고딕" w:hAnsi="맑은 고딕" w:eastAsia="맑은 고딕"/>
+                <w:color w:val="000000"/>
+                <w:sz w:val="30"/>
+              </w:rPr>
+              <w:t>취청오이(특) 1박스</w:t>
+            </w:r>
+          </w:p>
+          <w:p>
+            <w:pPr>
+              <w:spacing w:before="20" w:after="20" w:line="360" w:lineRule="exact"/>
+              <w:ind w:left="0" w:firstLine="0"/>
+            </w:pPr>
+            <w:r>
+              <w:rPr>
+                <w:rFonts w:ascii="맑은 고딕" w:hAnsi="맑은 고딕" w:eastAsia="맑은 고딕"/>
+                <w:color w:val="000000"/>
+                <w:sz w:val="30"/>
+              </w:rPr>
+              <w:t>세척당근 1박스</w:t>
+            </w:r>
+          </w:p>
+          <w:p>
+            <w:pPr>
+              <w:spacing w:before="20" w:after="20" w:line="360" w:lineRule="exact"/>
+              <w:ind w:left="0" w:firstLine="0"/>
+            </w:pPr>
+            <w:r>
+              <w:rPr>
+                <w:rFonts w:ascii="맑은 고딕" w:hAnsi="맑은 고딕" w:eastAsia="맑은 고딕"/>
+                <w:color w:val="000000"/>
+                <w:sz w:val="30"/>
+              </w:rPr>
+              <w:t>꽃느타리 4박스</w:t>
+            </w:r>
+          </w:p>
+          <w:p>
+            <w:pPr>
+              <w:spacing w:before="20" w:after="20" w:line="360" w:lineRule="exact"/>
+              <w:ind w:left="0" w:firstLine="0"/>
+            </w:pPr>
+            <w:r>
+              <w:rPr>
+                <w:rFonts w:ascii="맑은 고딕" w:hAnsi="맑은 고딕" w:eastAsia="맑은 고딕"/>
+                <w:color w:val="000000"/>
+                <w:sz w:val="30"/>
+              </w:rPr>
+              <w:t>새송이 4박스</w:t>
+            </w:r>
+          </w:p>
+          <w:p>
+            <w:pPr>
+              <w:spacing w:before="20" w:after="20" w:line="360" w:lineRule="exact"/>
+              <w:ind w:left="0" w:firstLine="0"/>
+            </w:pPr>
+            <w:r>
+              <w:rPr>
+                <w:rFonts w:ascii="맑은 고딕" w:hAnsi="맑은 고딕" w:eastAsia="맑은 고딕"/>
+                <w:color w:val="000000"/>
+                <w:sz w:val="30"/>
+              </w:rPr>
+              <w:t>팽이 3박스(그린피스)</w:t>
+            </w:r>
+          </w:p>
+          <w:p>
+            <w:pPr>
+              <w:spacing w:before="20" w:after="20" w:line="360" w:lineRule="exact"/>
+              <w:ind w:left="0" w:firstLine="0"/>
+            </w:pPr>
+            <w:r>
+              <w:rPr>
+                <w:rFonts w:ascii="맑은 고딕" w:hAnsi="맑은 고딕" w:eastAsia="맑은 고딕"/>
+                <w:color w:val="000000"/>
+                <w:sz w:val="30"/>
+              </w:rPr>
+              <w:t>돌미나리 2박스</w:t>
+            </w:r>
+          </w:p>
+          <w:p>
+            <w:pPr>
+              <w:spacing w:before="20" w:after="20" w:line="360" w:lineRule="exact"/>
+              <w:ind w:left="0" w:firstLine="0"/>
+            </w:pPr>
+            <w:r>
+              <w:rPr>
+                <w:rFonts w:ascii="맑은 고딕" w:hAnsi="맑은 고딕" w:eastAsia="맑은 고딕"/>
+                <w:color w:val="000000"/>
+                <w:sz w:val="30"/>
+              </w:rPr>
+              <w:t>케일 1박스</w:t>
+            </w:r>
+          </w:p>
+          <w:p>
+            <w:pPr>
+              <w:spacing w:before="20" w:after="20" w:line="360" w:lineRule="exact"/>
+              <w:ind w:left="0" w:firstLine="0"/>
+            </w:pPr>
+            <w:r>
+              <w:rPr>
+                <w:rFonts w:ascii="맑은 고딕" w:hAnsi="맑은 고딕" w:eastAsia="맑은 고딕"/>
+                <w:color w:val="000000"/>
+                <w:sz w:val="30"/>
+              </w:rPr>
+              <w:t>청경채 3박스</w:t>
+            </w:r>
+          </w:p>
+          <w:p>
+            <w:pPr>
+              <w:spacing w:before="20" w:after="20" w:line="360" w:lineRule="exact"/>
+              <w:ind w:left="0" w:firstLine="0"/>
+            </w:pPr>
+            <w:r>
+              <w:rPr>
+                <w:rFonts w:ascii="맑은 고딕" w:hAnsi="맑은 고딕" w:eastAsia="맑은 고딕"/>
+                <w:color w:val="0000FF"/>
+                <w:sz w:val="30"/>
+              </w:rPr>
+              <w:t>새싹(대) 4팩</w:t>
+            </w:r>
+          </w:p>
+          <w:p>
+            <w:pPr>
+              <w:spacing w:before="20" w:after="20" w:line="360" w:lineRule="exact"/>
+              <w:ind w:left="0" w:firstLine="0"/>
+            </w:pPr>
+            <w:r>
+              <w:rPr>
+                <w:rFonts w:ascii="맑은 고딕" w:hAnsi="맑은 고딕" w:eastAsia="맑은 고딕"/>
+                <w:color w:val="000000"/>
+                <w:sz w:val="30"/>
+              </w:rPr>
+              <w:t>중란 5판</w:t>
+            </w:r>
+          </w:p>
+          <w:p>
+            <w:pPr>
+              <w:spacing w:before="20" w:after="20" w:line="360" w:lineRule="exact"/>
+              <w:ind w:left="0" w:firstLine="0"/>
+            </w:pPr>
+            <w:r>
+              <w:rPr>
+                <w:rFonts w:ascii="맑은 고딕" w:hAnsi="맑은 고딕" w:eastAsia="맑은 고딕"/>
+                <w:color w:val="000000"/>
+                <w:sz w:val="30"/>
+              </w:rPr>
+              <w:t>깐쪽파 2kg</w:t>
+            </w:r>
+          </w:p>
+          <w:p>
+            <w:pPr>
+              <w:spacing w:before="20" w:after="20" w:line="360" w:lineRule="exact"/>
+              <w:ind w:left="0" w:firstLine="0"/>
+            </w:pPr>
+            <w:r>
+              <w:rPr>
+                <w:rFonts w:ascii="맑은 고딕" w:hAnsi="맑은 고딕" w:eastAsia="맑은 고딕"/>
+                <w:color w:val="000000"/>
+                <w:sz w:val="30"/>
+              </w:rPr>
+              <w:t>숙주 4박스</w:t>
+            </w:r>
+          </w:p>
+          <w:p>
+            <w:pPr>
+              <w:spacing w:before="20" w:after="20" w:line="360" w:lineRule="exact"/>
+              <w:ind w:left="0" w:firstLine="0"/>
+            </w:pPr>
+            <w:r>
+              <w:rPr>
+                <w:rFonts w:ascii="맑은 고딕" w:hAnsi="맑은 고딕" w:eastAsia="맑은 고딕"/>
+                <w:color w:val="000000"/>
+                <w:sz w:val="30"/>
+              </w:rPr>
+              <w:t>파김치 1박스</w:t>
+            </w:r>
+          </w:p>
+          <w:p>
+            <w:pPr>
+              <w:spacing w:before="20" w:after="20" w:line="360" w:lineRule="exact"/>
+              <w:ind w:left="0" w:firstLine="0"/>
+            </w:pPr>
+            <w:r>
+              <w:rPr>
+                <w:rFonts w:ascii="맑은 고딕" w:hAnsi="맑은 고딕" w:eastAsia="맑은 고딕"/>
+                <w:color w:val="000000"/>
+                <w:sz w:val="30"/>
+              </w:rPr>
+              <w:t>귤 2박스</w:t>
+            </w:r>
+          </w:p>
+          <w:p>
+            <w:pPr>
+              <w:spacing w:before="20" w:after="20" w:line="360" w:lineRule="exact"/>
+              <w:ind w:left="0" w:firstLine="0"/>
+            </w:pPr>
+            <w:r>
+              <w:rPr>
+                <w:rFonts w:ascii="맑은 고딕" w:hAnsi="맑은 고딕" w:eastAsia="맑은 고딕"/>
+                <w:color w:val="000000"/>
+                <w:sz w:val="30"/>
+              </w:rPr>
+              <w:t>표고버섯2L 1박스</w:t>
+            </w:r>
+          </w:p>
+          <w:p>
+            <w:pPr>
+              <w:spacing w:before="20" w:after="20" w:line="360" w:lineRule="exact"/>
+              <w:ind w:left="0" w:firstLine="0"/>
+            </w:pPr>
+            <w:r>
+              <w:rPr>
+                <w:rFonts w:ascii="맑은 고딕" w:hAnsi="맑은 고딕" w:eastAsia="맑은 고딕"/>
+                <w:color w:val="000000"/>
+                <w:sz w:val="30"/>
+              </w:rPr>
+              <w:t>쑥갓 1박스</w:t>
+            </w:r>
+          </w:p>
+          <w:p>
+            <w:pPr>
+              <w:spacing w:before="20" w:after="20" w:line="360" w:lineRule="exact"/>
+              <w:ind w:left="0" w:firstLine="0"/>
+            </w:pPr>
+            <w:r>
+              <w:rPr>
+                <w:rFonts w:ascii="맑은 고딕" w:hAnsi="맑은 고딕" w:eastAsia="맑은 고딕"/>
+                <w:color w:val="000000"/>
+                <w:sz w:val="30"/>
+              </w:rPr>
+              <w:t>깻잎(1K) 2박스</w:t>
+            </w:r>
+          </w:p>
+          <w:p>
+            <w:pPr>
+              <w:spacing w:before="300" w:after="20" w:line="360" w:lineRule="exact"/>
+              <w:ind w:left="0" w:firstLine="0"/>
+            </w:pPr>
+            <w:r>
+              <w:rPr>
+                <w:rFonts w:ascii="맑은 고딕" w:hAnsi="맑은 고딕" w:eastAsia="맑은 고딕"/>
+                <w:b/>
+                <w:color w:val="000000"/>
+                <w:sz w:val="30"/>
+              </w:rPr>
+              <w:t>-동원1차</w:t>
+            </w:r>
+          </w:p>
+          <w:p>
+            <w:pPr>
+              <w:spacing w:before="20" w:after="20" w:line="360" w:lineRule="exact"/>
+              <w:ind w:left="0" w:firstLine="0"/>
+            </w:pPr>
+            <w:r>
+              <w:rPr>
+                <w:rFonts w:ascii="맑은 고딕" w:hAnsi="맑은 고딕" w:eastAsia="맑은 고딕"/>
+                <w:color w:val="000000"/>
+                <w:sz w:val="30"/>
+              </w:rPr>
+              <w:t>양상추 4통</w:t>
+            </w:r>
+          </w:p>
+          <w:p>
+            <w:pPr>
+              <w:spacing w:before="20" w:after="20" w:line="360" w:lineRule="exact"/>
+              <w:ind w:left="0" w:firstLine="0"/>
+            </w:pPr>
+            <w:r>
+              <w:rPr>
+                <w:rFonts w:ascii="맑은 고딕" w:hAnsi="맑은 고딕" w:eastAsia="맑은 고딕"/>
+                <w:color w:val="000000"/>
+                <w:sz w:val="30"/>
+              </w:rPr>
+              <w:t>양상추 2박스</w:t>
+            </w:r>
+          </w:p>
+          <w:p>
+            <w:pPr>
+              <w:spacing w:before="20" w:after="20" w:line="360" w:lineRule="exact"/>
+              <w:ind w:left="0" w:firstLine="0"/>
+            </w:pPr>
+            <w:r>
+              <w:rPr>
+                <w:rFonts w:ascii="맑은 고딕" w:hAnsi="맑은 고딕" w:eastAsia="맑은 고딕"/>
+                <w:color w:val="000000"/>
+                <w:sz w:val="30"/>
+              </w:rPr>
+              <w:t>감자(왕특) 5KG</w:t>
+            </w:r>
+          </w:p>
+          <w:p>
+            <w:pPr>
+              <w:spacing w:before="20" w:after="20" w:line="360" w:lineRule="exact"/>
+              <w:ind w:left="0" w:firstLine="0"/>
+            </w:pPr>
+            <w:r>
+              <w:rPr>
+                <w:rFonts w:ascii="맑은 고딕" w:hAnsi="맑은 고딕" w:eastAsia="맑은 고딕"/>
+                <w:color w:val="000000"/>
+                <w:sz w:val="30"/>
+              </w:rPr>
+              <w:t>적채 1통</w:t>
+            </w:r>
+          </w:p>
+          <w:p>
+            <w:pPr>
+              <w:spacing w:before="20" w:after="20" w:line="360" w:lineRule="exact"/>
+              <w:ind w:left="0" w:firstLine="0"/>
+            </w:pPr>
+            <w:r>
+              <w:rPr>
+                <w:rFonts w:ascii="맑은 고딕" w:hAnsi="맑은 고딕" w:eastAsia="맑은 고딕"/>
+                <w:color w:val="000000"/>
+                <w:sz w:val="30"/>
+              </w:rPr>
+              <w:t>깐양파2호10KG 2봉</w:t>
+            </w:r>
+          </w:p>
+          <w:p>
+            <w:pPr>
+              <w:spacing w:before="20" w:after="20" w:line="360" w:lineRule="exact"/>
+              <w:ind w:left="0" w:firstLine="0"/>
+            </w:pPr>
+            <w:r>
+              <w:rPr>
+                <w:rFonts w:ascii="맑은 고딕" w:hAnsi="맑은 고딕" w:eastAsia="맑은 고딕"/>
+                <w:color w:val="000000"/>
+                <w:sz w:val="30"/>
+              </w:rPr>
+              <w:t>깐양파2호5KG 6봉</w:t>
+            </w:r>
+          </w:p>
+          <w:p>
+            <w:pPr>
+              <w:spacing w:before="20" w:after="20" w:line="360" w:lineRule="exact"/>
+              <w:ind w:left="0" w:firstLine="0"/>
+            </w:pPr>
+            <w:r>
+              <w:rPr>
+                <w:rFonts w:ascii="맑은 고딕" w:hAnsi="맑은 고딕" w:eastAsia="맑은 고딕"/>
+                <w:color w:val="000000"/>
+                <w:sz w:val="30"/>
+              </w:rPr>
+              <w:t>깐대파(대)1KG 5봉</w:t>
+            </w:r>
+          </w:p>
+          <w:p>
+            <w:pPr>
+              <w:spacing w:before="20" w:after="20" w:line="360" w:lineRule="exact"/>
+              <w:ind w:left="0" w:firstLine="0"/>
+            </w:pPr>
+            <w:r>
+              <w:rPr>
+                <w:rFonts w:ascii="맑은 고딕" w:hAnsi="맑은 고딕" w:eastAsia="맑은 고딕"/>
+                <w:color w:val="000000"/>
+                <w:sz w:val="30"/>
+              </w:rPr>
+              <w:t>팽이 1박스</w:t>
+            </w:r>
+          </w:p>
+          <w:p>
+            <w:pPr>
+              <w:spacing w:before="20" w:after="20" w:line="360" w:lineRule="exact"/>
+              <w:ind w:left="0" w:firstLine="0"/>
+            </w:pPr>
+            <w:r>
+              <w:rPr>
+                <w:rFonts w:ascii="맑은 고딕" w:hAnsi="맑은 고딕" w:eastAsia="맑은 고딕"/>
+                <w:color w:val="000000"/>
+                <w:sz w:val="30"/>
+              </w:rPr>
+              <w:t>새송이 2박스</w:t>
+            </w:r>
+          </w:p>
+          <w:p>
+            <w:pPr>
+              <w:spacing w:before="20" w:after="20" w:line="360" w:lineRule="exact"/>
+              <w:ind w:left="0" w:firstLine="0"/>
+            </w:pPr>
+            <w:r>
+              <w:rPr>
+                <w:rFonts w:ascii="맑은 고딕" w:hAnsi="맑은 고딕" w:eastAsia="맑은 고딕"/>
+                <w:color w:val="000000"/>
+                <w:sz w:val="30"/>
+              </w:rPr>
+              <w:t>표고버섯2L 1박스</w:t>
+            </w:r>
+          </w:p>
+          <w:p>
+            <w:pPr>
+              <w:spacing w:before="20" w:after="20" w:line="360" w:lineRule="exact"/>
+              <w:ind w:left="0" w:firstLine="0"/>
+            </w:pPr>
+            <w:r>
+              <w:rPr>
+                <w:rFonts w:ascii="맑은 고딕" w:hAnsi="맑은 고딕" w:eastAsia="맑은 고딕"/>
+                <w:color w:val="000000"/>
+                <w:sz w:val="30"/>
+              </w:rPr>
+              <w:t>청경채 1박스</w:t>
+            </w:r>
+          </w:p>
+          <w:p>
+            <w:pPr>
+              <w:spacing w:before="20" w:after="20" w:line="360" w:lineRule="exact"/>
+              <w:ind w:left="0" w:firstLine="0"/>
+            </w:pPr>
+            <w:r>
+              <w:rPr>
+                <w:rFonts w:ascii="맑은 고딕" w:hAnsi="맑은 고딕" w:eastAsia="맑은 고딕"/>
+                <w:color w:val="000000"/>
+                <w:sz w:val="30"/>
+              </w:rPr>
+              <w:t>알배기(상) 1박스</w:t>
+            </w:r>
+          </w:p>
+          <w:p>
+            <w:pPr>
+              <w:spacing w:before="20" w:after="20" w:line="360" w:lineRule="exact"/>
+              <w:ind w:left="0" w:firstLine="0"/>
+            </w:pPr>
+            <w:r>
+              <w:rPr>
+                <w:rFonts w:ascii="맑은 고딕" w:hAnsi="맑은 고딕" w:eastAsia="맑은 고딕"/>
+                <w:color w:val="000000"/>
+                <w:sz w:val="30"/>
+              </w:rPr>
+              <w:t>양배추40 2망</w:t>
+            </w:r>
+          </w:p>
         </w:tc>
       </w:tr>
     </w:tbl>
@@ -1530,7 +2291,77 @@
                 <w:color w:val="000000"/>
                 <w:sz w:val="30"/>
               </w:rPr>
+              <w:t>대란 10판</w:t>
+            </w:r>
+          </w:p>
+          <w:p>
+            <w:pPr>
+              <w:spacing w:before="20" w:after="20" w:line="360" w:lineRule="exact"/>
+              <w:ind w:left="0" w:firstLine="0"/>
+            </w:pPr>
+            <w:r>
+              <w:rPr>
+                <w:rFonts w:ascii="맑은 고딕" w:hAnsi="맑은 고딕" w:eastAsia="맑은 고딕"/>
+                <w:color w:val="000000"/>
+                <w:sz w:val="30"/>
+              </w:rPr>
+              <w:t>특란 6판</w:t>
+            </w:r>
+          </w:p>
+          <w:p>
+            <w:pPr>
+              <w:spacing w:before="20" w:after="20" w:line="360" w:lineRule="exact"/>
+              <w:ind w:left="0" w:firstLine="0"/>
+            </w:pPr>
+            <w:r>
+              <w:rPr>
+                <w:rFonts w:ascii="맑은 고딕" w:hAnsi="맑은 고딕" w:eastAsia="맑은 고딕"/>
+                <w:color w:val="000000"/>
+                <w:sz w:val="30"/>
+              </w:rPr>
               <w:t>중란 10판</w:t>
+            </w:r>
+          </w:p>
+          <w:p>
+            <w:pPr>
+              <w:spacing w:before="20" w:after="20" w:line="360" w:lineRule="exact"/>
+              <w:ind w:left="0" w:firstLine="0"/>
+            </w:pPr>
+            <w:r>
+              <w:rPr>
+                <w:rFonts w:ascii="맑은 고딕" w:hAnsi="맑은 고딕" w:eastAsia="맑은 고딕"/>
+                <w:color w:val="000000"/>
+                <w:sz w:val="30"/>
+              </w:rPr>
+              <w:t>중란 3판(도봉)</w:t>
+            </w:r>
+          </w:p>
+          <w:p>
+            <w:pPr>
+              <w:spacing w:before="20" w:after="20" w:line="360" w:lineRule="exact"/>
+              <w:ind w:left="0" w:firstLine="0"/>
+            </w:pPr>
+            <w:r>
+              <w:rPr>
+                <w:rFonts w:ascii="맑은 고딕" w:hAnsi="맑은 고딕" w:eastAsia="맑은 고딕"/>
+                <w:color w:val="000000"/>
+                <w:sz w:val="30"/>
+              </w:rPr>
+              <w:t>중란 2판(주안)</w:t>
+            </w:r>
+          </w:p>
+          <w:p>
+            <w:pPr>
+              <w:spacing w:before="20" w:after="20" w:line="360" w:lineRule="exact"/>
+              <w:ind w:left="0" w:firstLine="0"/>
+            </w:pPr>
+            <w:r>
+              <w:rPr>
+                <w:rFonts w:ascii="맑은 고딕" w:hAnsi="맑은 고딕" w:eastAsia="맑은 고딕"/>
+                <w:color w:val="000000"/>
+                <w:sz w:val="30"/>
+              </w:rPr>
+              <w:t>중란 5판(동탄)</w:t>
             </w:r>
           </w:p>
           <w:p>
@@ -1559,7 +2390,7 @@
                 <w:color w:val="000000"/>
                 <w:sz w:val="30"/>
               </w:rPr>
-              <w:t>세척당근(3L) 1박스</w:t>
+              <w:t>감자(왕특) 5KG</w:t>
             </w:r>
           </w:p>
           <w:p>
@@ -1573,21 +2404,7 @@
                 <w:color w:val="000000"/>
                 <w:sz w:val="30"/>
               </w:rPr>
-              <w:t>감자(왕특) 5kg</w:t>
-            </w:r>
-          </w:p>
-          <w:p>
-            <w:pPr>
-              <w:spacing w:before="20" w:after="20" w:line="360" w:lineRule="exact"/>
-              <w:ind w:left="0" w:firstLine="0"/>
-            </w:pPr>
-            <w:r>
-              <w:rPr>
-                <w:rFonts w:ascii="맑은 고딕" w:hAnsi="맑은 고딕" w:eastAsia="맑은 고딕"/>
-                <w:color w:val="000000"/>
-                <w:sz w:val="30"/>
-              </w:rPr>
-              <w:t>감자(싼왕왕) 1박스</w:t>
+              <w:t>감자(왕특) 1박스</w:t>
             </w:r>
           </w:p>
           <w:p>
@@ -1616,21 +2433,7 @@
                 <w:color w:val="000000"/>
                 <w:sz w:val="30"/>
               </w:rPr>
-              <w:t>취청오이(특,굵은) 3박스</w:t>
-            </w:r>
-          </w:p>
-          <w:p>
-            <w:pPr>
-              <w:spacing w:before="20" w:after="20" w:line="360" w:lineRule="exact"/>
-              <w:ind w:left="0" w:firstLine="0"/>
-            </w:pPr>
-            <w:r>
-              <w:rPr>
-                <w:rFonts w:ascii="맑은 고딕" w:hAnsi="맑은 고딕" w:eastAsia="맑은 고딕"/>
-                <w:color w:val="000000"/>
-                <w:sz w:val="30"/>
-              </w:rPr>
-              <w:t>취청오이(특) 1박스</w:t>
+              <w:t>취청오이(특) 4박스</w:t>
             </w:r>
           </w:p>
           <w:p>
@@ -1659,7 +2462,7 @@
                 <w:color w:val="000000"/>
                 <w:sz w:val="30"/>
               </w:rPr>
-              <w:t>팽이 5박스</w:t>
+              <w:t>새송이 32박스</w:t>
             </w:r>
           </w:p>
           <w:p>
@@ -1673,7 +2476,7 @@
                 <w:color w:val="000000"/>
                 <w:sz w:val="30"/>
               </w:rPr>
-              <w:t>꽃느타리 5박스</w:t>
+              <w:t>맛느타리 4박스</w:t>
             </w:r>
           </w:p>
           <w:p>
@@ -1687,7 +2490,7 @@
                 <w:color w:val="000000"/>
                 <w:sz w:val="30"/>
               </w:rPr>
-              <w:t>맛느타리 3박스</w:t>
+              <w:t>팽이 12박스</w:t>
             </w:r>
           </w:p>
           <w:p>
@@ -1701,7 +2504,7 @@
                 <w:color w:val="000000"/>
                 <w:sz w:val="30"/>
               </w:rPr>
-              <w:t>새송이 6박스</w:t>
+              <w:t>팽이 6박스(그린피스)</w:t>
             </w:r>
           </w:p>
           <w:p>
@@ -1715,7 +2518,49 @@
                 <w:color w:val="000000"/>
                 <w:sz w:val="30"/>
               </w:rPr>
-              <w:t>표고버섯2L 2박스</w:t>
+              <w:t>팽이 15개(마곡)</w:t>
+            </w:r>
+          </w:p>
+          <w:p>
+            <w:pPr>
+              <w:spacing w:before="20" w:after="20" w:line="360" w:lineRule="exact"/>
+              <w:ind w:left="0" w:firstLine="0"/>
+            </w:pPr>
+            <w:r>
+              <w:rPr>
+                <w:rFonts w:ascii="맑은 고딕" w:hAnsi="맑은 고딕" w:eastAsia="맑은 고딕"/>
+                <w:color w:val="000000"/>
+                <w:sz w:val="30"/>
+              </w:rPr>
+              <w:t>새송이(국산,상,2k) 20박스( 80k)</w:t>
+            </w:r>
+          </w:p>
+          <w:p>
+            <w:pPr>
+              <w:spacing w:before="20" w:after="20" w:line="360" w:lineRule="exact"/>
+              <w:ind w:left="0" w:firstLine="0"/>
+            </w:pPr>
+            <w:r>
+              <w:rPr>
+                <w:rFonts w:ascii="맑은 고딕" w:hAnsi="맑은 고딕" w:eastAsia="맑은 고딕"/>
+                <w:color w:val="000000"/>
+                <w:sz w:val="30"/>
+              </w:rPr>
+              <w:t>꽃느타리 26박스</w:t>
+            </w:r>
+          </w:p>
+          <w:p>
+            <w:pPr>
+              <w:spacing w:before="20" w:after="20" w:line="360" w:lineRule="exact"/>
+              <w:ind w:left="0" w:firstLine="0"/>
+            </w:pPr>
+            <w:r>
+              <w:rPr>
+                <w:rFonts w:ascii="맑은 고딕" w:hAnsi="맑은 고딕" w:eastAsia="맑은 고딕"/>
+                <w:color w:val="000000"/>
+                <w:sz w:val="30"/>
+              </w:rPr>
+              <w:t>표고버섯2L 10박스</w:t>
             </w:r>
           </w:p>
           <w:p>
@@ -1744,7 +2589,7 @@
                 <w:color w:val="000000"/>
                 <w:sz w:val="30"/>
               </w:rPr>
-              <w:t>흙대파 10단</w:t>
+              <w:t>깐대파 35kg</w:t>
             </w:r>
           </w:p>
           <w:p>
@@ -1758,7 +2603,7 @@
                 <w:color w:val="000000"/>
                 <w:sz w:val="30"/>
               </w:rPr>
-              <w:t>깐쪽파 3kg</w:t>
+              <w:t>깐대파 10KG</w:t>
             </w:r>
           </w:p>
           <w:p>
@@ -1772,7 +2617,7 @@
                 <w:color w:val="000000"/>
                 <w:sz w:val="30"/>
               </w:rPr>
-              <w:t>깐대파 20kg</w:t>
+              <w:t>흙대파 4단</w:t>
             </w:r>
           </w:p>
           <w:p>
@@ -1786,7 +2631,7 @@
                 <w:color w:val="000000"/>
                 <w:sz w:val="30"/>
               </w:rPr>
-              <w:t>깐쪽파0.5k 2봉</w:t>
+              <w:t>깐쪽파 7kg</w:t>
             </w:r>
           </w:p>
           <w:p>
@@ -1800,7 +2645,91 @@
                 <w:color w:val="000000"/>
                 <w:sz w:val="30"/>
               </w:rPr>
-              <w:t>깐대파(대)1kg 5봉</w:t>
+              <w:t>깐쪽파 1단</w:t>
+            </w:r>
+          </w:p>
+          <w:p>
+            <w:pPr>
+              <w:spacing w:before="20" w:after="20" w:line="360" w:lineRule="exact"/>
+              <w:ind w:left="0" w:firstLine="0"/>
+            </w:pPr>
+            <w:r>
+              <w:rPr>
+                <w:rFonts w:ascii="맑은 고딕" w:hAnsi="맑은 고딕" w:eastAsia="맑은 고딕"/>
+                <w:color w:val="000000"/>
+                <w:sz w:val="30"/>
+              </w:rPr>
+              <w:t>깐대파(대)1KG 5봉</w:t>
+            </w:r>
+          </w:p>
+          <w:p>
+            <w:pPr>
+              <w:spacing w:before="20" w:after="20" w:line="360" w:lineRule="exact"/>
+              <w:ind w:left="0" w:firstLine="0"/>
+            </w:pPr>
+            <w:r>
+              <w:rPr>
+                <w:rFonts w:ascii="맑은 고딕" w:hAnsi="맑은 고딕" w:eastAsia="맑은 고딕"/>
+                <w:color w:val="000000"/>
+                <w:sz w:val="30"/>
+              </w:rPr>
+              <w:t>깐대파(대) 10kg 4봉</w:t>
+            </w:r>
+          </w:p>
+          <w:p>
+            <w:pPr>
+              <w:spacing w:before="20" w:after="20" w:line="360" w:lineRule="exact"/>
+              <w:ind w:left="0" w:firstLine="0"/>
+            </w:pPr>
+            <w:r>
+              <w:rPr>
+                <w:rFonts w:ascii="맑은 고딕" w:hAnsi="맑은 고딕" w:eastAsia="맑은 고딕"/>
+                <w:color w:val="000000"/>
+                <w:sz w:val="30"/>
+              </w:rPr>
+              <w:t>깐대파(대) 5kg 1봉</w:t>
+            </w:r>
+          </w:p>
+          <w:p>
+            <w:pPr>
+              <w:spacing w:before="20" w:after="20" w:line="360" w:lineRule="exact"/>
+              <w:ind w:left="0" w:firstLine="0"/>
+            </w:pPr>
+            <w:r>
+              <w:rPr>
+                <w:rFonts w:ascii="맑은 고딕" w:hAnsi="맑은 고딕" w:eastAsia="맑은 고딕"/>
+                <w:color w:val="000000"/>
+                <w:sz w:val="30"/>
+              </w:rPr>
+              <w:t>깐대파(대) 1KG 5봉</w:t>
+            </w:r>
+          </w:p>
+          <w:p>
+            <w:pPr>
+              <w:spacing w:before="20" w:after="20" w:line="360" w:lineRule="exact"/>
+              <w:ind w:left="0" w:firstLine="0"/>
+            </w:pPr>
+            <w:r>
+              <w:rPr>
+                <w:rFonts w:ascii="맑은 고딕" w:hAnsi="맑은 고딕" w:eastAsia="맑은 고딕"/>
+                <w:color w:val="000000"/>
+                <w:sz w:val="30"/>
+              </w:rPr>
+              <w:t>깐쪽파 2kg 3봉</w:t>
+            </w:r>
+          </w:p>
+          <w:p>
+            <w:pPr>
+              <w:spacing w:before="20" w:after="20" w:line="360" w:lineRule="exact"/>
+              <w:ind w:left="0" w:firstLine="0"/>
+            </w:pPr>
+            <w:r>
+              <w:rPr>
+                <w:rFonts w:ascii="맑은 고딕" w:hAnsi="맑은 고딕" w:eastAsia="맑은 고딕"/>
+                <w:color w:val="000000"/>
+                <w:sz w:val="30"/>
+              </w:rPr>
+              <w:t>깐쪽파 1kg 2봉</w:t>
             </w:r>
           </w:p>
           <w:p>
@@ -1829,7 +2758,7 @@
                 <w:color w:val="000000"/>
                 <w:sz w:val="30"/>
               </w:rPr>
-              <w:t>배추 1통</w:t>
+              <w:t>배추 3망( 9포기)</w:t>
             </w:r>
           </w:p>
           <w:p>
@@ -1843,7 +2772,149 @@
                 <w:color w:val="000000"/>
                 <w:sz w:val="30"/>
               </w:rPr>
-              <w:t>배추 3망</w:t>
+              <w:t>무 2통</w:t>
+            </w:r>
+          </w:p>
+          <w:p>
+            <w:pPr>
+              <w:spacing w:before="20" w:after="20" w:line="360" w:lineRule="exact"/>
+              <w:ind w:left="0" w:firstLine="0"/>
+            </w:pPr>
+            <w:r>
+              <w:rPr>
+                <w:rFonts w:ascii="맑은 고딕" w:hAnsi="맑은 고딕" w:eastAsia="맑은 고딕"/>
+                <w:color w:val="000000"/>
+                <w:sz w:val="30"/>
+              </w:rPr>
+              <w:t>무 2통(마곡)</w:t>
+            </w:r>
+          </w:p>
+          <w:p>
+            <w:pPr>
+              <w:spacing w:before="20" w:after="20" w:line="360" w:lineRule="exact"/>
+              <w:ind w:left="0" w:firstLine="0"/>
+            </w:pPr>
+            <w:r>
+              <w:rPr>
+                <w:rFonts w:ascii="맑은 고딕" w:hAnsi="맑은 고딕" w:eastAsia="맑은 고딕"/>
+                <w:color w:val="000000"/>
+                <w:sz w:val="30"/>
+              </w:rPr>
+              <w:t>배추 13망</w:t>
+            </w:r>
+          </w:p>
+          <w:p>
+            <w:pPr>
+              <w:spacing w:before="300" w:after="20" w:line="360" w:lineRule="exact"/>
+              <w:ind w:left="0" w:firstLine="0"/>
+            </w:pPr>
+            <w:r>
+              <w:rPr>
+                <w:rFonts w:ascii="맑은 고딕" w:hAnsi="맑은 고딕" w:eastAsia="맑은 고딕"/>
+                <w:b/>
+                <w:color w:val="000000"/>
+                <w:sz w:val="30"/>
+              </w:rPr>
+              <w:t>-백제유통</w:t>
+            </w:r>
+          </w:p>
+          <w:p>
+            <w:pPr>
+              <w:spacing w:before="20" w:after="20" w:line="360" w:lineRule="exact"/>
+              <w:ind w:left="0" w:firstLine="0"/>
+            </w:pPr>
+            <w:r>
+              <w:rPr>
+                <w:rFonts w:ascii="맑은 고딕" w:hAnsi="맑은 고딕" w:eastAsia="맑은 고딕"/>
+                <w:color w:val="000000"/>
+                <w:sz w:val="30"/>
+              </w:rPr>
+              <w:t>딜 2팩</w:t>
+            </w:r>
+          </w:p>
+          <w:p>
+            <w:pPr>
+              <w:spacing w:before="300" w:after="20" w:line="360" w:lineRule="exact"/>
+              <w:ind w:left="0" w:firstLine="0"/>
+            </w:pPr>
+            <w:r>
+              <w:rPr>
+                <w:rFonts w:ascii="맑은 고딕" w:hAnsi="맑은 고딕" w:eastAsia="맑은 고딕"/>
+                <w:b/>
+                <w:color w:val="000000"/>
+                <w:sz w:val="30"/>
+              </w:rPr>
+              <w:t>-브럭시</w:t>
+            </w:r>
+          </w:p>
+          <w:p>
+            <w:pPr>
+              <w:spacing w:before="20" w:after="20" w:line="360" w:lineRule="exact"/>
+              <w:ind w:left="0" w:firstLine="0"/>
+            </w:pPr>
+            <w:r>
+              <w:rPr>
+                <w:rFonts w:ascii="맑은 고딕" w:hAnsi="맑은 고딕" w:eastAsia="맑은 고딕"/>
+                <w:color w:val="000000"/>
+                <w:sz w:val="30"/>
+              </w:rPr>
+              <w:t>양상추 10통</w:t>
+            </w:r>
+          </w:p>
+          <w:p>
+            <w:pPr>
+              <w:spacing w:before="20" w:after="20" w:line="360" w:lineRule="exact"/>
+              <w:ind w:left="0" w:firstLine="0"/>
+            </w:pPr>
+            <w:r>
+              <w:rPr>
+                <w:rFonts w:ascii="맑은 고딕" w:hAnsi="맑은 고딕" w:eastAsia="맑은 고딕"/>
+                <w:color w:val="000000"/>
+                <w:sz w:val="30"/>
+              </w:rPr>
+              <w:t>깐양배추42 2통</w:t>
+            </w:r>
+          </w:p>
+          <w:p>
+            <w:pPr>
+              <w:spacing w:before="20" w:after="20" w:line="360" w:lineRule="exact"/>
+              <w:ind w:left="0" w:firstLine="0"/>
+            </w:pPr>
+            <w:r>
+              <w:rPr>
+                <w:rFonts w:ascii="맑은 고딕" w:hAnsi="맑은 고딕" w:eastAsia="맑은 고딕"/>
+                <w:color w:val="000000"/>
+                <w:sz w:val="30"/>
+              </w:rPr>
+              <w:t>통로메인 1박스</w:t>
+            </w:r>
+          </w:p>
+          <w:p>
+            <w:pPr>
+              <w:spacing w:before="20" w:after="20" w:line="360" w:lineRule="exact"/>
+              <w:ind w:left="0" w:firstLine="0"/>
+            </w:pPr>
+            <w:r>
+              <w:rPr>
+                <w:rFonts w:ascii="맑은 고딕" w:hAnsi="맑은 고딕" w:eastAsia="맑은 고딕"/>
+                <w:color w:val="000000"/>
+                <w:sz w:val="30"/>
+              </w:rPr>
+              <w:t>바나나 1발</w:t>
+            </w:r>
+          </w:p>
+          <w:p>
+            <w:pPr>
+              <w:spacing w:before="20" w:after="20" w:line="360" w:lineRule="exact"/>
+              <w:ind w:left="0" w:firstLine="0"/>
+            </w:pPr>
+            <w:r>
+              <w:rPr>
+                <w:rFonts w:ascii="맑은 고딕" w:hAnsi="맑은 고딕" w:eastAsia="맑은 고딕"/>
+                <w:color w:val="000000"/>
+                <w:sz w:val="30"/>
+              </w:rPr>
+              <w:t>중숙아보카도 5개</w:t>
             </w:r>
           </w:p>
         </w:tc>
@@ -1883,7 +2954,35 @@
                 <w:color w:val="000000"/>
                 <w:sz w:val="30"/>
               </w:rPr>
-              <w:t>청양고추 5kg</w:t>
+              <w:t>청양고추 2박스</w:t>
+            </w:r>
+          </w:p>
+          <w:p>
+            <w:pPr>
+              <w:spacing w:before="20" w:after="20" w:line="360" w:lineRule="exact"/>
+              <w:ind w:left="0" w:firstLine="0"/>
+            </w:pPr>
+            <w:r>
+              <w:rPr>
+                <w:rFonts w:ascii="맑은 고딕" w:hAnsi="맑은 고딕" w:eastAsia="맑은 고딕"/>
+                <w:color w:val="000000"/>
+                <w:sz w:val="30"/>
+              </w:rPr>
+              <w:t>청양고추(특) 1박스</w:t>
+            </w:r>
+          </w:p>
+          <w:p>
+            <w:pPr>
+              <w:spacing w:before="20" w:after="20" w:line="360" w:lineRule="exact"/>
+              <w:ind w:left="0" w:firstLine="0"/>
+            </w:pPr>
+            <w:r>
+              <w:rPr>
+                <w:rFonts w:ascii="맑은 고딕" w:hAnsi="맑은 고딕" w:eastAsia="맑은 고딕"/>
+                <w:color w:val="000000"/>
+                <w:sz w:val="30"/>
+              </w:rPr>
+              <w:t>청양고추(상) 1박스</w:t>
             </w:r>
           </w:p>
           <w:p>
@@ -1898,7 +2997,7 @@
                 <w:color w:val="000000"/>
                 <w:sz w:val="30"/>
               </w:rPr>
-              <w:t>-영운농산</w:t>
+              <w:t>-소유 프루트(어제선발주완료)</w:t>
             </w:r>
           </w:p>
           <w:p>
@@ -1912,7 +3011,7 @@
                 <w:color w:val="000000"/>
                 <w:sz w:val="30"/>
               </w:rPr>
-              <w:t>쑥갓 2박스</w:t>
+              <w:t>애플망고 1박스</w:t>
             </w:r>
           </w:p>
           <w:p>
@@ -1926,7 +3025,7 @@
                 <w:color w:val="000000"/>
                 <w:sz w:val="30"/>
               </w:rPr>
-              <w:t>청상추 1박스</w:t>
+              <w:t>용과 1박스</w:t>
             </w:r>
           </w:p>
           <w:p>
@@ -1940,7 +3039,7 @@
                 <w:color w:val="000000"/>
                 <w:sz w:val="30"/>
               </w:rPr>
-              <w:t>청경채 7박스</w:t>
+              <w:t>미니허니파인10수 1박스</w:t>
             </w:r>
           </w:p>
           <w:p>
@@ -1954,7 +3053,7 @@
                 <w:color w:val="000000"/>
                 <w:sz w:val="30"/>
               </w:rPr>
-              <w:t>근대 3박스</w:t>
+              <w:t>금실딸기 1박스</w:t>
             </w:r>
           </w:p>
           <w:p>
@@ -1968,21 +3067,7 @@
                 <w:color w:val="000000"/>
                 <w:sz w:val="30"/>
               </w:rPr>
-              <w:t>깻잎(1k) 3박스</w:t>
-            </w:r>
-          </w:p>
-          <w:p>
-            <w:pPr>
-              <w:spacing w:before="20" w:after="20" w:line="360" w:lineRule="exact"/>
-              <w:ind w:left="0" w:firstLine="0"/>
-            </w:pPr>
-            <w:r>
-              <w:rPr>
-                <w:rFonts w:ascii="맑은 고딕" w:hAnsi="맑은 고딕" w:eastAsia="맑은 고딕"/>
-                <w:color w:val="000000"/>
-                <w:sz w:val="30"/>
-              </w:rPr>
-              <w:t>케일 1박스</w:t>
+              <w:t>샤인머스켓4수 1박스</w:t>
             </w:r>
           </w:p>
           <w:p>
@@ -1997,7 +3082,7 @@
                 <w:color w:val="000000"/>
                 <w:sz w:val="30"/>
               </w:rPr>
-              <w:t>-오복상회</w:t>
+              <w:t>-영운농산</w:t>
             </w:r>
           </w:p>
           <w:p>
@@ -2011,7 +3096,7 @@
                 <w:color w:val="000000"/>
                 <w:sz w:val="30"/>
               </w:rPr>
-              <w:t>굵은숙주 35박스</w:t>
+              <w:t>청경채 26박스</w:t>
             </w:r>
           </w:p>
           <w:p>
@@ -2025,7 +3110,7 @@
                 <w:color w:val="000000"/>
                 <w:sz w:val="30"/>
               </w:rPr>
-              <w:t>깐양파 10KG</w:t>
+              <w:t>케일 6박스</w:t>
             </w:r>
           </w:p>
           <w:p>
@@ -2039,7 +3124,7 @@
                 <w:color w:val="000000"/>
                 <w:sz w:val="30"/>
               </w:rPr>
-              <w:t>깐양파 27kg</w:t>
+              <w:t>쑥갓 10박스</w:t>
             </w:r>
           </w:p>
           <w:p>
@@ -2053,7 +3138,7 @@
                 <w:color w:val="000000"/>
                 <w:sz w:val="30"/>
               </w:rPr>
-              <w:t>일자콩나물 1박스</w:t>
+              <w:t>쑥갓 2박스(박스확인필요)</w:t>
             </w:r>
           </w:p>
           <w:p>
@@ -2067,7 +3152,7 @@
                 <w:color w:val="000000"/>
                 <w:sz w:val="30"/>
               </w:rPr>
-              <w:t>피양파 2망</w:t>
+              <w:t>근대 6박스</w:t>
             </w:r>
           </w:p>
           <w:p>
@@ -2081,7 +3166,7 @@
                 <w:color w:val="000000"/>
                 <w:sz w:val="30"/>
               </w:rPr>
-              <w:t>곱슬이콩나물 1박스</w:t>
+              <w:t>깻잎(1k) 10박스</w:t>
             </w:r>
           </w:p>
           <w:p>
@@ -2095,7 +3180,7 @@
                 <w:color w:val="000000"/>
                 <w:sz w:val="30"/>
               </w:rPr>
-              <w:t>숙주 14박스</w:t>
+              <w:t>잎로메인 2박스</w:t>
             </w:r>
           </w:p>
           <w:p>
@@ -2109,7 +3194,7 @@
                 <w:color w:val="000000"/>
                 <w:sz w:val="30"/>
               </w:rPr>
-              <w:t>순두부400g 5팩</w:t>
+              <w:t>깻잎(1K) 2박스</w:t>
             </w:r>
           </w:p>
           <w:p>
@@ -2123,35 +3208,7 @@
                 <w:color w:val="000000"/>
                 <w:sz w:val="30"/>
               </w:rPr>
-              <w:t>깐양파2호10k 1봉</w:t>
-            </w:r>
-          </w:p>
-          <w:p>
-            <w:pPr>
-              <w:spacing w:before="20" w:after="20" w:line="360" w:lineRule="exact"/>
-              <w:ind w:left="0" w:firstLine="0"/>
-            </w:pPr>
-            <w:r>
-              <w:rPr>
-                <w:rFonts w:ascii="맑은 고딕" w:hAnsi="맑은 고딕" w:eastAsia="맑은 고딕"/>
-                <w:color w:val="000000"/>
-                <w:sz w:val="30"/>
-              </w:rPr>
-              <w:t>깐양파2호5k 6봉</w:t>
-            </w:r>
-          </w:p>
-          <w:p>
-            <w:pPr>
-              <w:spacing w:before="20" w:after="20" w:line="360" w:lineRule="exact"/>
-              <w:ind w:left="0" w:firstLine="0"/>
-            </w:pPr>
-            <w:r>
-              <w:rPr>
-                <w:rFonts w:ascii="맑은 고딕" w:hAnsi="맑은 고딕" w:eastAsia="맑은 고딕"/>
-                <w:color w:val="000000"/>
-                <w:sz w:val="30"/>
-              </w:rPr>
-              <w:t>깐마늘(중)0.5k 3봉</w:t>
+              <w:t>알배기(상) 2박스</w:t>
             </w:r>
           </w:p>
           <w:p>
@@ -2166,7 +3223,7 @@
                 <w:color w:val="000000"/>
                 <w:sz w:val="30"/>
               </w:rPr>
-              <w:t>-이모유통</w:t>
+              <w:t>-오복상회</w:t>
             </w:r>
           </w:p>
           <w:p>
@@ -2180,7 +3237,7 @@
                 <w:color w:val="000000"/>
                 <w:sz w:val="30"/>
               </w:rPr>
-              <w:t>완숙토마토1호 1박스</w:t>
+              <w:t>곱슬이콩나물 4박스</w:t>
             </w:r>
           </w:p>
           <w:p>
@@ -2194,7 +3251,7 @@
                 <w:color w:val="000000"/>
                 <w:sz w:val="30"/>
               </w:rPr>
-              <w:t>귤 3박스</w:t>
+              <w:t>깐양파 67kg</w:t>
             </w:r>
           </w:p>
           <w:p>
@@ -2208,7 +3265,303 @@
                 <w:color w:val="000000"/>
                 <w:sz w:val="30"/>
               </w:rPr>
-              <w:t>레몬(165과) 1박스 -확인예정</w:t>
+              <w:t>깐양파 20KG</w:t>
+            </w:r>
+          </w:p>
+          <w:p>
+            <w:pPr>
+              <w:spacing w:before="20" w:after="20" w:line="360" w:lineRule="exact"/>
+              <w:ind w:left="0" w:firstLine="0"/>
+            </w:pPr>
+            <w:r>
+              <w:rPr>
+                <w:rFonts w:ascii="맑은 고딕" w:hAnsi="맑은 고딕" w:eastAsia="맑은 고딕"/>
+                <w:color w:val="000000"/>
+                <w:sz w:val="30"/>
+              </w:rPr>
+              <w:t>깐마늘(중) 40kg</w:t>
+            </w:r>
+          </w:p>
+          <w:p>
+            <w:pPr>
+              <w:spacing w:before="20" w:after="20" w:line="360" w:lineRule="exact"/>
+              <w:ind w:left="0" w:firstLine="0"/>
+            </w:pPr>
+            <w:r>
+              <w:rPr>
+                <w:rFonts w:ascii="맑은 고딕" w:hAnsi="맑은 고딕" w:eastAsia="맑은 고딕"/>
+                <w:color w:val="000000"/>
+                <w:sz w:val="30"/>
+              </w:rPr>
+              <w:t>숙주 36박스</w:t>
+            </w:r>
+          </w:p>
+          <w:p>
+            <w:pPr>
+              <w:spacing w:before="20" w:after="20" w:line="360" w:lineRule="exact"/>
+              <w:ind w:left="0" w:firstLine="0"/>
+            </w:pPr>
+            <w:r>
+              <w:rPr>
+                <w:rFonts w:ascii="맑은 고딕" w:hAnsi="맑은 고딕" w:eastAsia="맑은 고딕"/>
+                <w:color w:val="000000"/>
+                <w:sz w:val="30"/>
+              </w:rPr>
+              <w:t>일자콩나물 2박스</w:t>
+            </w:r>
+          </w:p>
+          <w:p>
+            <w:pPr>
+              <w:spacing w:before="20" w:after="20" w:line="360" w:lineRule="exact"/>
+              <w:ind w:left="0" w:firstLine="0"/>
+            </w:pPr>
+            <w:r>
+              <w:rPr>
+                <w:rFonts w:ascii="맑은 고딕" w:hAnsi="맑은 고딕" w:eastAsia="맑은 고딕"/>
+                <w:color w:val="000000"/>
+                <w:sz w:val="30"/>
+              </w:rPr>
+              <w:t>굵은숙주 16박스</w:t>
+            </w:r>
+          </w:p>
+          <w:p>
+            <w:pPr>
+              <w:spacing w:before="20" w:after="20" w:line="360" w:lineRule="exact"/>
+              <w:ind w:left="0" w:firstLine="0"/>
+            </w:pPr>
+            <w:r>
+              <w:rPr>
+                <w:rFonts w:ascii="맑은 고딕" w:hAnsi="맑은 고딕" w:eastAsia="맑은 고딕"/>
+                <w:color w:val="000000"/>
+                <w:sz w:val="30"/>
+              </w:rPr>
+              <w:t>깐마늘(대) 4.5kg</w:t>
+            </w:r>
+          </w:p>
+          <w:p>
+            <w:pPr>
+              <w:spacing w:before="20" w:after="20" w:line="360" w:lineRule="exact"/>
+              <w:ind w:left="0" w:firstLine="0"/>
+            </w:pPr>
+            <w:r>
+              <w:rPr>
+                <w:rFonts w:ascii="맑은 고딕" w:hAnsi="맑은 고딕" w:eastAsia="맑은 고딕"/>
+                <w:color w:val="000000"/>
+                <w:sz w:val="30"/>
+              </w:rPr>
+              <w:t>깐마늘(대) 4.5KG</w:t>
+            </w:r>
+          </w:p>
+          <w:p>
+            <w:pPr>
+              <w:spacing w:before="20" w:after="20" w:line="360" w:lineRule="exact"/>
+              <w:ind w:left="0" w:firstLine="0"/>
+            </w:pPr>
+            <w:r>
+              <w:rPr>
+                <w:rFonts w:ascii="맑은 고딕" w:hAnsi="맑은 고딕" w:eastAsia="맑은 고딕"/>
+                <w:color w:val="000000"/>
+                <w:sz w:val="30"/>
+              </w:rPr>
+              <w:t>우엉(국산,4k) 10관</w:t>
+            </w:r>
+          </w:p>
+          <w:p>
+            <w:pPr>
+              <w:spacing w:before="20" w:after="20" w:line="360" w:lineRule="exact"/>
+              <w:ind w:left="0" w:firstLine="0"/>
+            </w:pPr>
+            <w:r>
+              <w:rPr>
+                <w:rFonts w:ascii="맑은 고딕" w:hAnsi="맑은 고딕" w:eastAsia="맑은 고딕"/>
+                <w:color w:val="000000"/>
+                <w:sz w:val="30"/>
+              </w:rPr>
+              <w:t>깐양파2호10KG 2봉</w:t>
+            </w:r>
+          </w:p>
+          <w:p>
+            <w:pPr>
+              <w:spacing w:before="20" w:after="20" w:line="360" w:lineRule="exact"/>
+              <w:ind w:left="0" w:firstLine="0"/>
+            </w:pPr>
+            <w:r>
+              <w:rPr>
+                <w:rFonts w:ascii="맑은 고딕" w:hAnsi="맑은 고딕" w:eastAsia="맑은 고딕"/>
+                <w:color w:val="000000"/>
+                <w:sz w:val="30"/>
+              </w:rPr>
+              <w:t>깐양파2호5KG 6봉</w:t>
+            </w:r>
+          </w:p>
+          <w:p>
+            <w:pPr>
+              <w:spacing w:before="20" w:after="20" w:line="360" w:lineRule="exact"/>
+              <w:ind w:left="0" w:firstLine="0"/>
+            </w:pPr>
+            <w:r>
+              <w:rPr>
+                <w:rFonts w:ascii="맑은 고딕" w:hAnsi="맑은 고딕" w:eastAsia="맑은 고딕"/>
+                <w:color w:val="000000"/>
+                <w:sz w:val="30"/>
+              </w:rPr>
+              <w:t>깐양파2호 10kg 9봉</w:t>
+            </w:r>
+          </w:p>
+          <w:p>
+            <w:pPr>
+              <w:spacing w:before="20" w:after="20" w:line="360" w:lineRule="exact"/>
+              <w:ind w:left="0" w:firstLine="0"/>
+            </w:pPr>
+            <w:r>
+              <w:rPr>
+                <w:rFonts w:ascii="맑은 고딕" w:hAnsi="맑은 고딕" w:eastAsia="맑은 고딕"/>
+                <w:color w:val="000000"/>
+                <w:sz w:val="30"/>
+              </w:rPr>
+              <w:t>깐양파2호 7kg 1봉</w:t>
+            </w:r>
+          </w:p>
+          <w:p>
+            <w:pPr>
+              <w:spacing w:before="20" w:after="20" w:line="360" w:lineRule="exact"/>
+              <w:ind w:left="0" w:firstLine="0"/>
+            </w:pPr>
+            <w:r>
+              <w:rPr>
+                <w:rFonts w:ascii="맑은 고딕" w:hAnsi="맑은 고딕" w:eastAsia="맑은 고딕"/>
+                <w:color w:val="000000"/>
+                <w:sz w:val="30"/>
+              </w:rPr>
+              <w:t>깐양파2호 5kg 8봉</w:t>
+            </w:r>
+          </w:p>
+          <w:p>
+            <w:pPr>
+              <w:spacing w:before="20" w:after="20" w:line="360" w:lineRule="exact"/>
+              <w:ind w:left="0" w:firstLine="0"/>
+            </w:pPr>
+            <w:r>
+              <w:rPr>
+                <w:rFonts w:ascii="맑은 고딕" w:hAnsi="맑은 고딕" w:eastAsia="맑은 고딕"/>
+                <w:color w:val="000000"/>
+                <w:sz w:val="30"/>
+              </w:rPr>
+              <w:t>굵은숙주 108박스(+보관7박스 내일 총 115박스)</w:t>
+            </w:r>
+          </w:p>
+          <w:p>
+            <w:pPr>
+              <w:spacing w:before="20" w:after="20" w:line="360" w:lineRule="exact"/>
+              <w:ind w:left="0" w:firstLine="0"/>
+            </w:pPr>
+            <w:r>
+              <w:rPr>
+                <w:rFonts w:ascii="맑은 고딕" w:hAnsi="맑은 고딕" w:eastAsia="맑은 고딕"/>
+                <w:color w:val="000000"/>
+                <w:sz w:val="30"/>
+              </w:rPr>
+              <w:t>쌀 2포(분당)</w:t>
+            </w:r>
+          </w:p>
+          <w:p>
+            <w:pPr>
+              <w:spacing w:before="300" w:after="20" w:line="360" w:lineRule="exact"/>
+              <w:ind w:left="0" w:firstLine="0"/>
+            </w:pPr>
+            <w:r>
+              <w:rPr>
+                <w:rFonts w:ascii="맑은 고딕" w:hAnsi="맑은 고딕" w:eastAsia="맑은 고딕"/>
+                <w:b/>
+                <w:color w:val="000000"/>
+                <w:sz w:val="30"/>
+              </w:rPr>
+              <w:t>-우신농산</w:t>
+            </w:r>
+          </w:p>
+          <w:p>
+            <w:pPr>
+              <w:spacing w:before="20" w:after="20" w:line="360" w:lineRule="exact"/>
+              <w:ind w:left="0" w:firstLine="0"/>
+            </w:pPr>
+            <w:r>
+              <w:rPr>
+                <w:rFonts w:ascii="맑은 고딕" w:hAnsi="맑은 고딕" w:eastAsia="맑은 고딕"/>
+                <w:color w:val="000000"/>
+                <w:sz w:val="30"/>
+              </w:rPr>
+              <w:t>간마늘(대) 3kg</w:t>
+            </w:r>
+          </w:p>
+          <w:p>
+            <w:pPr>
+              <w:spacing w:before="20" w:after="20" w:line="360" w:lineRule="exact"/>
+              <w:ind w:left="0" w:firstLine="0"/>
+            </w:pPr>
+            <w:r>
+              <w:rPr>
+                <w:rFonts w:ascii="맑은 고딕" w:hAnsi="맑은 고딕" w:eastAsia="맑은 고딕"/>
+                <w:color w:val="000000"/>
+                <w:sz w:val="30"/>
+              </w:rPr>
+              <w:t>간마늘 3kg</w:t>
+            </w:r>
+          </w:p>
+          <w:p>
+            <w:pPr>
+              <w:spacing w:before="300" w:after="20" w:line="360" w:lineRule="exact"/>
+              <w:ind w:left="0" w:firstLine="0"/>
+            </w:pPr>
+            <w:r>
+              <w:rPr>
+                <w:rFonts w:ascii="맑은 고딕" w:hAnsi="맑은 고딕" w:eastAsia="맑은 고딕"/>
+                <w:b/>
+                <w:color w:val="000000"/>
+                <w:sz w:val="30"/>
+              </w:rPr>
+              <w:t>-육회꽃필무렵</w:t>
+            </w:r>
+          </w:p>
+          <w:p>
+            <w:pPr>
+              <w:spacing w:before="20" w:after="20" w:line="360" w:lineRule="exact"/>
+              <w:ind w:left="0" w:firstLine="0"/>
+            </w:pPr>
+            <w:r>
+              <w:rPr>
+                <w:rFonts w:ascii="맑은 고딕" w:hAnsi="맑은 고딕" w:eastAsia="맑은 고딕"/>
+                <w:color w:val="000000"/>
+                <w:sz w:val="30"/>
+              </w:rPr>
+              <w:t>곱슬이콩나물 2박스</w:t>
+            </w:r>
+          </w:p>
+          <w:p>
+            <w:pPr>
+              <w:spacing w:before="20" w:after="20" w:line="360" w:lineRule="exact"/>
+              <w:ind w:left="0" w:firstLine="0"/>
+            </w:pPr>
+            <w:r>
+              <w:rPr>
+                <w:rFonts w:ascii="맑은 고딕" w:hAnsi="맑은 고딕" w:eastAsia="맑은 고딕"/>
+                <w:color w:val="000000"/>
+                <w:sz w:val="30"/>
+              </w:rPr>
+              <w:t>적채 5통</w:t>
+            </w:r>
+          </w:p>
+          <w:p>
+            <w:pPr>
+              <w:spacing w:before="20" w:after="20" w:line="360" w:lineRule="exact"/>
+              <w:ind w:left="0" w:firstLine="0"/>
+            </w:pPr>
+            <w:r>
+              <w:rPr>
+                <w:rFonts w:ascii="맑은 고딕" w:hAnsi="맑은 고딕" w:eastAsia="맑은 고딕"/>
+                <w:color w:val="000000"/>
+                <w:sz w:val="30"/>
+              </w:rPr>
+              <w:t>대란 5판</w:t>
             </w:r>
           </w:p>
         </w:tc>
@@ -2234,7 +3587,7 @@
                 <w:color w:val="000000"/>
                 <w:sz w:val="30"/>
               </w:rPr>
-              <w:t>-정운</w:t>
+              <w:t>-이너프유</w:t>
             </w:r>
           </w:p>
           <w:p>
@@ -2248,7 +3601,63 @@
                 <w:color w:val="000000"/>
                 <w:sz w:val="30"/>
               </w:rPr>
-              <w:t>포기김치 1박스</w:t>
+              <w:t>깐양파 30kg</w:t>
+            </w:r>
+          </w:p>
+          <w:p>
+            <w:pPr>
+              <w:spacing w:before="20" w:after="20" w:line="360" w:lineRule="exact"/>
+              <w:ind w:left="0" w:firstLine="0"/>
+            </w:pPr>
+            <w:r>
+              <w:rPr>
+                <w:rFonts w:ascii="맑은 고딕" w:hAnsi="맑은 고딕" w:eastAsia="맑은 고딕"/>
+                <w:color w:val="000000"/>
+                <w:sz w:val="30"/>
+              </w:rPr>
+              <w:t>새송이(국산,상,2k) 20박스( 40k)</w:t>
+            </w:r>
+          </w:p>
+          <w:p>
+            <w:pPr>
+              <w:spacing w:before="20" w:after="20" w:line="360" w:lineRule="exact"/>
+              <w:ind w:left="0" w:firstLine="0"/>
+            </w:pPr>
+            <w:r>
+              <w:rPr>
+                <w:rFonts w:ascii="맑은 고딕" w:hAnsi="맑은 고딕" w:eastAsia="맑은 고딕"/>
+                <w:color w:val="000000"/>
+                <w:sz w:val="30"/>
+              </w:rPr>
+              <w:t>애호박(국산,상,6.5k) 4박스</w:t>
+            </w:r>
+          </w:p>
+          <w:p>
+            <w:pPr>
+              <w:spacing w:before="20" w:after="20" w:line="360" w:lineRule="exact"/>
+              <w:ind w:left="0" w:firstLine="0"/>
+            </w:pPr>
+            <w:r>
+              <w:rPr>
+                <w:rFonts w:ascii="맑은 고딕" w:hAnsi="맑은 고딕" w:eastAsia="맑은 고딕"/>
+                <w:color w:val="000000"/>
+                <w:sz w:val="30"/>
+              </w:rPr>
+              <w:t>고구마(국산,왕,10k) 2박스</w:t>
+            </w:r>
+          </w:p>
+          <w:p>
+            <w:pPr>
+              <w:spacing w:before="20" w:after="20" w:line="360" w:lineRule="exact"/>
+              <w:ind w:left="0" w:firstLine="0"/>
+            </w:pPr>
+            <w:r>
+              <w:rPr>
+                <w:rFonts w:ascii="맑은 고딕" w:hAnsi="맑은 고딕" w:eastAsia="맑은 고딕"/>
+                <w:color w:val="000000"/>
+                <w:sz w:val="30"/>
+              </w:rPr>
+              <w:t>우엉(국산,4k) 5관</w:t>
             </w:r>
           </w:p>
           <w:p>
@@ -2263,7 +3672,7 @@
                 <w:color w:val="000000"/>
                 <w:sz w:val="30"/>
               </w:rPr>
-              <w:t>-초원농산</w:t>
+              <w:t>-이모유통</w:t>
             </w:r>
           </w:p>
           <w:p>
@@ -2277,7 +3686,133 @@
                 <w:color w:val="000000"/>
                 <w:sz w:val="30"/>
               </w:rPr>
-              <w:t>적채 1박스</w:t>
+              <w:t>바나나 2발</w:t>
+            </w:r>
+          </w:p>
+          <w:p>
+            <w:pPr>
+              <w:spacing w:before="20" w:after="20" w:line="360" w:lineRule="exact"/>
+              <w:ind w:left="0" w:firstLine="0"/>
+            </w:pPr>
+            <w:r>
+              <w:rPr>
+                <w:rFonts w:ascii="맑은 고딕" w:hAnsi="맑은 고딕" w:eastAsia="맑은 고딕"/>
+                <w:color w:val="000000"/>
+                <w:sz w:val="30"/>
+              </w:rPr>
+              <w:t>귤 8박스</w:t>
+            </w:r>
+          </w:p>
+          <w:p>
+            <w:pPr>
+              <w:spacing w:before="20" w:after="20" w:line="360" w:lineRule="exact"/>
+              <w:ind w:left="0" w:firstLine="0"/>
+            </w:pPr>
+            <w:r>
+              <w:rPr>
+                <w:rFonts w:ascii="맑은 고딕" w:hAnsi="맑은 고딕" w:eastAsia="맑은 고딕"/>
+                <w:color w:val="000000"/>
+                <w:sz w:val="30"/>
+              </w:rPr>
+              <w:t>애플망고 1박스</w:t>
+            </w:r>
+          </w:p>
+          <w:p>
+            <w:pPr>
+              <w:spacing w:before="20" w:after="20" w:line="360" w:lineRule="exact"/>
+              <w:ind w:left="0" w:firstLine="0"/>
+            </w:pPr>
+            <w:r>
+              <w:rPr>
+                <w:rFonts w:ascii="맑은 고딕" w:hAnsi="맑은 고딕" w:eastAsia="맑은 고딕"/>
+                <w:color w:val="000000"/>
+                <w:sz w:val="30"/>
+              </w:rPr>
+              <w:t>용과 1박스</w:t>
+            </w:r>
+          </w:p>
+          <w:p>
+            <w:pPr>
+              <w:spacing w:before="20" w:after="20" w:line="360" w:lineRule="exact"/>
+              <w:ind w:left="0" w:firstLine="0"/>
+            </w:pPr>
+            <w:r>
+              <w:rPr>
+                <w:rFonts w:ascii="맑은 고딕" w:hAnsi="맑은 고딕" w:eastAsia="맑은 고딕"/>
+                <w:color w:val="000000"/>
+                <w:sz w:val="30"/>
+              </w:rPr>
+              <w:t>미니허니파인10수 1박스</w:t>
+            </w:r>
+          </w:p>
+          <w:p>
+            <w:pPr>
+              <w:spacing w:before="20" w:after="20" w:line="360" w:lineRule="exact"/>
+              <w:ind w:left="0" w:firstLine="0"/>
+            </w:pPr>
+            <w:r>
+              <w:rPr>
+                <w:rFonts w:ascii="맑은 고딕" w:hAnsi="맑은 고딕" w:eastAsia="맑은 고딕"/>
+                <w:color w:val="000000"/>
+                <w:sz w:val="30"/>
+              </w:rPr>
+              <w:t>금실딸기 1박스</w:t>
+            </w:r>
+          </w:p>
+          <w:p>
+            <w:pPr>
+              <w:spacing w:before="20" w:after="20" w:line="360" w:lineRule="exact"/>
+              <w:ind w:left="0" w:firstLine="0"/>
+            </w:pPr>
+            <w:r>
+              <w:rPr>
+                <w:rFonts w:ascii="맑은 고딕" w:hAnsi="맑은 고딕" w:eastAsia="맑은 고딕"/>
+                <w:color w:val="000000"/>
+                <w:sz w:val="30"/>
+              </w:rPr>
+              <w:t>샤인머스켓4수 1박스</w:t>
+            </w:r>
+          </w:p>
+          <w:p>
+            <w:pPr>
+              <w:spacing w:before="20" w:after="20" w:line="360" w:lineRule="exact"/>
+              <w:ind w:left="0" w:firstLine="0"/>
+            </w:pPr>
+            <w:r>
+              <w:rPr>
+                <w:rFonts w:ascii="맑은 고딕" w:hAnsi="맑은 고딕" w:eastAsia="맑은 고딕"/>
+                <w:color w:val="000000"/>
+                <w:sz w:val="30"/>
+              </w:rPr>
+              <w:t>완숙토마토1호 4박스</w:t>
+            </w:r>
+          </w:p>
+          <w:p>
+            <w:pPr>
+              <w:spacing w:before="20" w:after="20" w:line="360" w:lineRule="exact"/>
+              <w:ind w:left="0" w:firstLine="0"/>
+            </w:pPr>
+            <w:r>
+              <w:rPr>
+                <w:rFonts w:ascii="맑은 고딕" w:hAnsi="맑은 고딕" w:eastAsia="맑은 고딕"/>
+                <w:color w:val="000000"/>
+                <w:sz w:val="30"/>
+              </w:rPr>
+              <w:t>레몬 15개</w:t>
+            </w:r>
+          </w:p>
+          <w:p>
+            <w:pPr>
+              <w:spacing w:before="20" w:after="20" w:line="360" w:lineRule="exact"/>
+              <w:ind w:left="0" w:firstLine="0"/>
+            </w:pPr>
+            <w:r>
+              <w:rPr>
+                <w:rFonts w:ascii="맑은 고딕" w:hAnsi="맑은 고딕" w:eastAsia="맑은 고딕"/>
+                <w:color w:val="000000"/>
+                <w:sz w:val="30"/>
+              </w:rPr>
+              <w:t>레몬 15개(마곡)</w:t>
             </w:r>
           </w:p>
           <w:p>
@@ -2292,7 +3827,7 @@
                 <w:color w:val="000000"/>
                 <w:sz w:val="30"/>
               </w:rPr>
-              <w:t>-태현상회</w:t>
+              <w:t>-정복상회</w:t>
             </w:r>
           </w:p>
           <w:p>
@@ -2306,35 +3841,7 @@
                 <w:color w:val="000000"/>
                 <w:sz w:val="30"/>
               </w:rPr>
-              <w:t>깐양배추45 3망</w:t>
-            </w:r>
-          </w:p>
-          <w:p>
-            <w:pPr>
-              <w:spacing w:before="20" w:after="20" w:line="360" w:lineRule="exact"/>
-              <w:ind w:left="0" w:firstLine="0"/>
-            </w:pPr>
-            <w:r>
-              <w:rPr>
-                <w:rFonts w:ascii="맑은 고딕" w:hAnsi="맑은 고딕" w:eastAsia="맑은 고딕"/>
-                <w:color w:val="000000"/>
-                <w:sz w:val="30"/>
-              </w:rPr>
-              <w:t>깐양배추42 1통</w:t>
-            </w:r>
-          </w:p>
-          <w:p>
-            <w:pPr>
-              <w:spacing w:before="20" w:after="20" w:line="360" w:lineRule="exact"/>
-              <w:ind w:left="0" w:firstLine="0"/>
-            </w:pPr>
-            <w:r>
-              <w:rPr>
-                <w:rFonts w:ascii="맑은 고딕" w:hAnsi="맑은 고딕" w:eastAsia="맑은 고딕"/>
-                <w:color w:val="000000"/>
-                <w:sz w:val="30"/>
-              </w:rPr>
-              <w:t>양배추45 1망</w:t>
+              <w:t>새싹(대) 10팩</w:t>
             </w:r>
           </w:p>
           <w:p>
@@ -2349,6 +3856,219 @@
                 <w:color w:val="000000"/>
                 <w:sz w:val="30"/>
               </w:rPr>
+              <w:t>-정운</w:t>
+            </w:r>
+          </w:p>
+          <w:p>
+            <w:pPr>
+              <w:spacing w:before="20" w:after="20" w:line="360" w:lineRule="exact"/>
+              <w:ind w:left="0" w:firstLine="0"/>
+            </w:pPr>
+            <w:r>
+              <w:rPr>
+                <w:rFonts w:ascii="맑은 고딕" w:hAnsi="맑은 고딕" w:eastAsia="맑은 고딕"/>
+                <w:color w:val="000000"/>
+                <w:sz w:val="30"/>
+              </w:rPr>
+              <w:t>파김치 2박스</w:t>
+            </w:r>
+          </w:p>
+          <w:p>
+            <w:pPr>
+              <w:spacing w:before="300" w:after="20" w:line="360" w:lineRule="exact"/>
+              <w:ind w:left="0" w:firstLine="0"/>
+            </w:pPr>
+            <w:r>
+              <w:rPr>
+                <w:rFonts w:ascii="맑은 고딕" w:hAnsi="맑은 고딕" w:eastAsia="맑은 고딕"/>
+                <w:b/>
+                <w:color w:val="000000"/>
+                <w:sz w:val="30"/>
+              </w:rPr>
+              <w:t>-초원농산</w:t>
+            </w:r>
+          </w:p>
+          <w:p>
+            <w:pPr>
+              <w:spacing w:before="20" w:after="20" w:line="360" w:lineRule="exact"/>
+              <w:ind w:left="0" w:firstLine="0"/>
+            </w:pPr>
+            <w:r>
+              <w:rPr>
+                <w:rFonts w:ascii="맑은 고딕" w:hAnsi="맑은 고딕" w:eastAsia="맑은 고딕"/>
+                <w:color w:val="000000"/>
+                <w:sz w:val="30"/>
+              </w:rPr>
+              <w:t>양상추 24통</w:t>
+            </w:r>
+          </w:p>
+          <w:p>
+            <w:pPr>
+              <w:spacing w:before="20" w:after="20" w:line="360" w:lineRule="exact"/>
+              <w:ind w:left="0" w:firstLine="0"/>
+            </w:pPr>
+            <w:r>
+              <w:rPr>
+                <w:rFonts w:ascii="맑은 고딕" w:hAnsi="맑은 고딕" w:eastAsia="맑은 고딕"/>
+                <w:color w:val="000000"/>
+                <w:sz w:val="30"/>
+              </w:rPr>
+              <w:t>양상추 4박스</w:t>
+            </w:r>
+          </w:p>
+          <w:p>
+            <w:pPr>
+              <w:spacing w:before="20" w:after="20" w:line="360" w:lineRule="exact"/>
+              <w:ind w:left="0" w:firstLine="0"/>
+            </w:pPr>
+            <w:r>
+              <w:rPr>
+                <w:rFonts w:ascii="맑은 고딕" w:hAnsi="맑은 고딕" w:eastAsia="맑은 고딕"/>
+                <w:color w:val="000000"/>
+                <w:sz w:val="30"/>
+              </w:rPr>
+              <w:t>양상추 10통(브럭시)</w:t>
+            </w:r>
+          </w:p>
+          <w:p>
+            <w:pPr>
+              <w:spacing w:before="20" w:after="20" w:line="360" w:lineRule="exact"/>
+              <w:ind w:left="0" w:firstLine="0"/>
+            </w:pPr>
+            <w:r>
+              <w:rPr>
+                <w:rFonts w:ascii="맑은 고딕" w:hAnsi="맑은 고딕" w:eastAsia="맑은 고딕"/>
+                <w:color w:val="000000"/>
+                <w:sz w:val="30"/>
+              </w:rPr>
+              <w:t>양상추 10통(분당)</w:t>
+            </w:r>
+          </w:p>
+          <w:p>
+            <w:pPr>
+              <w:spacing w:before="20" w:after="20" w:line="360" w:lineRule="exact"/>
+              <w:ind w:left="0" w:firstLine="0"/>
+            </w:pPr>
+            <w:r>
+              <w:rPr>
+                <w:rFonts w:ascii="맑은 고딕" w:hAnsi="맑은 고딕" w:eastAsia="맑은 고딕"/>
+                <w:color w:val="000000"/>
+                <w:sz w:val="30"/>
+              </w:rPr>
+              <w:t>적채 1박스</w:t>
+            </w:r>
+          </w:p>
+          <w:p>
+            <w:pPr>
+              <w:spacing w:before="20" w:after="20" w:line="360" w:lineRule="exact"/>
+              <w:ind w:left="0" w:firstLine="0"/>
+            </w:pPr>
+            <w:r>
+              <w:rPr>
+                <w:rFonts w:ascii="맑은 고딕" w:hAnsi="맑은 고딕" w:eastAsia="맑은 고딕"/>
+                <w:color w:val="000000"/>
+                <w:sz w:val="30"/>
+              </w:rPr>
+              <w:t>적채 5통(브럭시)</w:t>
+            </w:r>
+          </w:p>
+          <w:p>
+            <w:pPr>
+              <w:spacing w:before="300" w:after="20" w:line="360" w:lineRule="exact"/>
+              <w:ind w:left="0" w:firstLine="0"/>
+            </w:pPr>
+            <w:r>
+              <w:rPr>
+                <w:rFonts w:ascii="맑은 고딕" w:hAnsi="맑은 고딕" w:eastAsia="맑은 고딕"/>
+                <w:b/>
+                <w:color w:val="000000"/>
+                <w:sz w:val="30"/>
+              </w:rPr>
+              <w:t>-태현상회</w:t>
+            </w:r>
+          </w:p>
+          <w:p>
+            <w:pPr>
+              <w:spacing w:before="20" w:after="20" w:line="360" w:lineRule="exact"/>
+              <w:ind w:left="0" w:firstLine="0"/>
+            </w:pPr>
+            <w:r>
+              <w:rPr>
+                <w:rFonts w:ascii="맑은 고딕" w:hAnsi="맑은 고딕" w:eastAsia="맑은 고딕"/>
+                <w:color w:val="000000"/>
+                <w:sz w:val="30"/>
+              </w:rPr>
+              <w:t>깐양배추42 4통</w:t>
+            </w:r>
+          </w:p>
+          <w:p>
+            <w:pPr>
+              <w:spacing w:before="20" w:after="20" w:line="360" w:lineRule="exact"/>
+              <w:ind w:left="0" w:firstLine="0"/>
+            </w:pPr>
+            <w:r>
+              <w:rPr>
+                <w:rFonts w:ascii="맑은 고딕" w:hAnsi="맑은 고딕" w:eastAsia="맑은 고딕"/>
+                <w:color w:val="000000"/>
+                <w:sz w:val="30"/>
+              </w:rPr>
+              <w:t>양배추45 1망( 3통)</w:t>
+            </w:r>
+          </w:p>
+          <w:p>
+            <w:pPr>
+              <w:spacing w:before="20" w:after="20" w:line="360" w:lineRule="exact"/>
+              <w:ind w:left="0" w:firstLine="0"/>
+            </w:pPr>
+            <w:r>
+              <w:rPr>
+                <w:rFonts w:ascii="맑은 고딕" w:hAnsi="맑은 고딕" w:eastAsia="맑은 고딕"/>
+                <w:color w:val="000000"/>
+                <w:sz w:val="30"/>
+              </w:rPr>
+              <w:t>깐양배추45 2망</w:t>
+            </w:r>
+          </w:p>
+          <w:p>
+            <w:pPr>
+              <w:spacing w:before="20" w:after="20" w:line="360" w:lineRule="exact"/>
+              <w:ind w:left="0" w:firstLine="0"/>
+            </w:pPr>
+            <w:r>
+              <w:rPr>
+                <w:rFonts w:ascii="맑은 고딕" w:hAnsi="맑은 고딕" w:eastAsia="맑은 고딕"/>
+                <w:color w:val="000000"/>
+                <w:sz w:val="30"/>
+              </w:rPr>
+              <w:t>양배추40 4망</w:t>
+            </w:r>
+          </w:p>
+          <w:p>
+            <w:pPr>
+              <w:spacing w:before="20" w:after="20" w:line="360" w:lineRule="exact"/>
+              <w:ind w:left="0" w:firstLine="0"/>
+            </w:pPr>
+            <w:r>
+              <w:rPr>
+                <w:rFonts w:ascii="맑은 고딕" w:hAnsi="맑은 고딕" w:eastAsia="맑은 고딕"/>
+                <w:color w:val="000000"/>
+                <w:sz w:val="30"/>
+              </w:rPr>
+              <w:t>양배추45 1망</w:t>
+            </w:r>
+          </w:p>
+          <w:p>
+            <w:pPr>
+              <w:spacing w:before="300" w:after="20" w:line="360" w:lineRule="exact"/>
+              <w:ind w:left="0" w:firstLine="0"/>
+            </w:pPr>
+            <w:r>
+              <w:rPr>
+                <w:rFonts w:ascii="맑은 고딕" w:hAnsi="맑은 고딕" w:eastAsia="맑은 고딕"/>
+                <w:b/>
+                <w:color w:val="000000"/>
+                <w:sz w:val="30"/>
+              </w:rPr>
               <w:t>-풍경농산</w:t>
             </w:r>
           </w:p>
@@ -2363,7 +4083,7 @@
                 <w:color w:val="000000"/>
                 <w:sz w:val="30"/>
               </w:rPr>
-              <w:t>돌미나리 3박스</w:t>
+              <w:t>돌미나리 14박스</w:t>
             </w:r>
           </w:p>
           <w:p>
@@ -2377,21 +4097,7 @@
                 <w:color w:val="000000"/>
                 <w:sz w:val="30"/>
               </w:rPr>
-              <w:t>미나리 3kg</w:t>
-            </w:r>
-          </w:p>
-          <w:p>
-            <w:pPr>
-              <w:spacing w:before="20" w:after="20" w:line="360" w:lineRule="exact"/>
-              <w:ind w:left="0" w:firstLine="0"/>
-            </w:pPr>
-            <w:r>
-              <w:rPr>
-                <w:rFonts w:ascii="맑은 고딕" w:hAnsi="맑은 고딕" w:eastAsia="맑은 고딕"/>
-                <w:color w:val="000000"/>
-                <w:sz w:val="30"/>
-              </w:rPr>
-              <w:t>부추 1단</w:t>
+              <w:t>미나리 10kg</w:t>
             </w:r>
           </w:p>
         </w:tc>
@@ -2453,7 +4159,7 @@
                 <w:color w:val="FF0000"/>
                 <w:sz w:val="30"/>
               </w:rPr>
-              <w:t>적채 1통(선데이)</w:t>
+              <w:t>적채 5통(육회꽃필)</w:t>
             </w:r>
           </w:p>
           <w:p>
@@ -2467,7 +4173,7 @@
                 <w:color w:val="FF0000"/>
                 <w:sz w:val="30"/>
               </w:rPr>
-              <w:t>청양고추 1kg(강남)</w:t>
+              <w:t>세척당근 2kg(강남)</w:t>
             </w:r>
           </w:p>
           <w:p>
@@ -2481,7 +4187,7 @@
                 <w:color w:val="FF0000"/>
                 <w:sz w:val="30"/>
               </w:rPr>
-              <w:t>팽이 5개(마곡)</w:t>
+              <w:t>팽이 15개(마곡)</w:t>
             </w:r>
           </w:p>
           <w:p>
@@ -2495,7 +4201,7 @@
                 <w:color w:val="FF0000"/>
                 <w:sz w:val="30"/>
               </w:rPr>
-              <w:t>세척당근 2kg(마곡)</w:t>
+              <w:t>청양고추 1kg(마곡)</w:t>
             </w:r>
           </w:p>
           <w:p>
@@ -2509,7 +4215,7 @@
                 <w:color w:val="FF0000"/>
                 <w:sz w:val="30"/>
               </w:rPr>
-              <w:t>애호박 2kg(마곡)</w:t>
+              <w:t>쌀 2포(분당)</w:t>
             </w:r>
           </w:p>
           <w:p>
@@ -2523,63 +4229,7 @@
                 <w:color w:val="FF0000"/>
                 <w:sz w:val="30"/>
               </w:rPr>
-              <w:t>청양고추 2kg(마곡)</w:t>
-            </w:r>
-          </w:p>
-          <w:p>
-            <w:pPr>
-              <w:spacing w:before="20" w:after="20" w:line="360" w:lineRule="exact"/>
-              <w:ind w:left="0" w:firstLine="0"/>
-            </w:pPr>
-            <w:r>
-              <w:rPr>
-                <w:rFonts w:ascii="맑은 고딕" w:hAnsi="맑은 고딕" w:eastAsia="맑은 고딕"/>
-                <w:color w:val="FF0000"/>
-                <w:sz w:val="30"/>
-              </w:rPr>
-              <w:t>맛느타리 2팩(마곡)</w:t>
-            </w:r>
-          </w:p>
-          <w:p>
-            <w:pPr>
-              <w:spacing w:before="20" w:after="20" w:line="360" w:lineRule="exact"/>
-              <w:ind w:left="0" w:firstLine="0"/>
-            </w:pPr>
-            <w:r>
-              <w:rPr>
-                <w:rFonts w:ascii="맑은 고딕" w:hAnsi="맑은 고딕" w:eastAsia="맑은 고딕"/>
-                <w:color w:val="FF0000"/>
-                <w:sz w:val="30"/>
-              </w:rPr>
-              <w:t>쌀 1포(주안)</w:t>
-            </w:r>
-          </w:p>
-          <w:p>
-            <w:pPr>
-              <w:spacing w:before="20" w:after="20" w:line="360" w:lineRule="exact"/>
-              <w:ind w:left="0" w:firstLine="0"/>
-            </w:pPr>
-            <w:r>
-              <w:rPr>
-                <w:rFonts w:ascii="맑은 고딕" w:hAnsi="맑은 고딕" w:eastAsia="맑은 고딕"/>
-                <w:color w:val="FF0000"/>
-                <w:sz w:val="30"/>
-              </w:rPr>
-              <w:t>감자 10kg(구월)</w:t>
-            </w:r>
-          </w:p>
-          <w:p>
-            <w:pPr>
-              <w:spacing w:before="20" w:after="20" w:line="360" w:lineRule="exact"/>
-              <w:ind w:left="0" w:firstLine="0"/>
-            </w:pPr>
-            <w:r>
-              <w:rPr>
-                <w:rFonts w:ascii="맑은 고딕" w:hAnsi="맑은 고딕" w:eastAsia="맑은 고딕"/>
-                <w:color w:val="FF0000"/>
-                <w:sz w:val="30"/>
-              </w:rPr>
-              <w:t>청양고추 0.5k(구월)</w:t>
+              <w:t>적채 1통(동원1차)</w:t>
             </w:r>
           </w:p>
         </w:tc>
@@ -2619,6 +4269,20 @@
                 <w:color w:val="0000FF"/>
                 <w:sz w:val="30"/>
               </w:rPr>
+              <w:t>새싹(대) 4팩(샤브야키)</w:t>
+            </w:r>
+          </w:p>
+          <w:p>
+            <w:pPr>
+              <w:spacing w:before="20" w:after="20" w:line="360" w:lineRule="exact"/>
+              <w:ind w:left="0" w:firstLine="0"/>
+            </w:pPr>
+            <w:r>
+              <w:rPr>
+                <w:rFonts w:ascii="맑은 고딕" w:hAnsi="맑은 고딕" w:eastAsia="맑은 고딕"/>
+                <w:color w:val="0000FF"/>
+                <w:sz w:val="30"/>
+              </w:rPr>
               <w:t>감자 15kg(강남)</w:t>
             </w:r>
           </w:p>
@@ -2633,7 +4297,7 @@
                 <w:color w:val="0000FF"/>
                 <w:sz w:val="30"/>
               </w:rPr>
-              <w:t>새싹(대) 2팩(주안)</w:t>
+              <w:t>새싹(대) 2팩(분당)</w:t>
             </w:r>
           </w:p>
           <w:p>
@@ -2647,7 +4311,21 @@
                 <w:color w:val="0000FF"/>
                 <w:sz w:val="30"/>
               </w:rPr>
-              <w:t>청양고추 5kg(분당)</w:t>
+              <w:t>새싹(대) 4팩(동탄)</w:t>
+            </w:r>
+          </w:p>
+          <w:p>
+            <w:pPr>
+              <w:spacing w:before="20" w:after="20" w:line="360" w:lineRule="exact"/>
+              <w:ind w:left="0" w:firstLine="0"/>
+            </w:pPr>
+            <w:r>
+              <w:rPr>
+                <w:rFonts w:ascii="맑은 고딕" w:hAnsi="맑은 고딕" w:eastAsia="맑은 고딕"/>
+                <w:color w:val="0000FF"/>
+                <w:sz w:val="30"/>
+              </w:rPr>
+              <w:t>새싹(대) 10팩(정복상회)</w:t>
             </w:r>
           </w:p>
         </w:tc>

</xml_diff>